<commit_message>
Add real product photos + hero, SVG icon set, embedded diagram report (use-case/DFD/ERD), image credits; clean up temp files
</commit_message>
<xml_diff>
--- a/docs/SportZone_Technical_Report.docx
+++ b/docs/SportZone_Technical_Report.docx
@@ -1,6 +1,6 @@
 
 <file path=word/document.xml><?xml version="1.0" encoding="utf-8"?>
-<w:document xmlns:w="http://schemas.openxmlformats.org/wordprocessingml/2006/main">
+<w:document xmlns:w="http://schemas.openxmlformats.org/wordprocessingml/2006/main" xmlns:r="http://schemas.openxmlformats.org/officeDocument/2006/relationships" xmlns:wp="http://schemas.openxmlformats.org/drawingml/2006/wordprocessingDrawing" xmlns:a="http://schemas.openxmlformats.org/drawingml/2006/main" xmlns:pic="http://schemas.openxmlformats.org/drawingml/2006/picture">
   <w:body>
     <w:p>
       <w:pPr>
@@ -689,7 +689,7 @@
           <w:sz w:val="21"/>
           <w:szCs w:val="21"/>
         </w:rPr>
-        <w:t xml:space="preserve">SportZone is a Business-to-Consumer (B2C) online store selling sports equipment, apparel and fitness accessories across five categories: Football, Basketball, Running, Gym and Sportswear. Customers can browse and search products, read and write reviews, save items to a wishlist, manage a shopping cart, apply promo codes and place orders through a multi-step checkout. Administrators manage the catalogue, orders, users and customer messages through a dedicated, role-protected admin panel. Prices are shown in Malaysian Ringgit (RM).</w:t>
+        <w:t xml:space="preserve">SportZone is a Business-to-Consumer (B2C) online store selling sports equipment, apparel and fitness accessories across five categories: Football, Basketball, Running, Gym and Sportswear. Customers can browse and search products, read and write reviews, save items to a wishlist, manage a shopping cart, apply promo codes and place orders through a multi-step checkout. Administrators manage the catalogue, orders, users and customer messages through a role-protected admin panel. Prices are shown in Malaysian Ringgit (RM).</w:t>
       </w:r>
     </w:p>
     <w:p>
@@ -883,7 +883,7 @@
           <w:sz w:val="21"/>
           <w:szCs w:val="21"/>
         </w:rPr>
-        <w:t xml:space="preserve">The team followed the Agile methodology, delivering the system incrementally across six sprints. Agile was chosen for its iterative nature, flexibility to adapt to technical challenges, support for parallel teamwork, and good fit with the assignment milestones (Week 6 proposal, Week 12 final submission).</w:t>
+        <w:t xml:space="preserve">The team followed the Agile methodology, delivering the system incrementally across six sprints. Agile was chosen for its iterative nature, flexibility, support for parallel teamwork, and good fit with the assignment milestones (Week 6 proposal, Week 12 final submission).</w:t>
       </w:r>
     </w:p>
     <w:tbl>
@@ -1220,7 +1220,7 @@
           <w:sz w:val="21"/>
           <w:szCs w:val="21"/>
         </w:rPr>
-        <w:t xml:space="preserve">Collaboration used GitHub for version control, a shared task list, and a group chat for daily coordination. Shared, reusable PHP includes (config, database connection, header, footer and helper functions) kept the code consistent and reduced merge conflicts between members.</w:t>
+        <w:t xml:space="preserve">Collaboration used GitHub for version control, a shared task list, and a group chat. Shared, reusable PHP includes (config, database connection, header, footer and helper functions) kept the code consistent and reduced merge conflicts.</w:t>
       </w:r>
     </w:p>
     <w:p>
@@ -1272,135 +1272,60 @@
     </w:p>
     <w:p>
       <w:pPr>
-        <w:spacing w:before="60" w:after="120"/>
-        <w:shd w:val="clear" w:fill="F4F5F7"/>
-      </w:pPr>
-      <w:r>
-        <w:rPr>
-          <w:rFonts w:ascii="Consolas" w:hAnsi="Consolas"/>
-          <w:sz w:val="16"/>
-        </w:rPr>
-        <w:t xml:space="preserve">  +-----------------------------------------------------------+</w:t>
-      </w:r>
-      <w:br/>
-      <w:r>
-        <w:rPr>
-          <w:rFonts w:ascii="Consolas" w:hAnsi="Consolas"/>
-          <w:sz w:val="16"/>
-        </w:rPr>
-        <w:t xml:space="preserve">  |  PRESENTATION TIER (Browser)                              |</w:t>
-      </w:r>
-      <w:br/>
-      <w:r>
-        <w:rPr>
-          <w:rFonts w:ascii="Consolas" w:hAnsi="Consolas"/>
-          <w:sz w:val="16"/>
-        </w:rPr>
-        <w:t xml:space="preserve">  |  HTML5 - CSS3 (custom) - Vanilla JavaScript               |</w:t>
-      </w:r>
-      <w:br/>
-      <w:r>
-        <w:rPr>
-          <w:rFonts w:ascii="Consolas" w:hAnsi="Consolas"/>
-          <w:sz w:val="16"/>
-        </w:rPr>
-        <w:t xml:space="preserve">  |  Responsive UI, client-side validation, AJAX, canvas chart|</w:t>
-      </w:r>
-      <w:br/>
-      <w:r>
-        <w:rPr>
-          <w:rFonts w:ascii="Consolas" w:hAnsi="Consolas"/>
-          <w:sz w:val="16"/>
-        </w:rPr>
-        <w:t xml:space="preserve">  +----------------------------+------------------------------+</w:t>
-      </w:r>
-      <w:br/>
-      <w:r>
-        <w:rPr>
-          <w:rFonts w:ascii="Consolas" w:hAnsi="Consolas"/>
-          <w:sz w:val="16"/>
-        </w:rPr>
-        <w:t xml:space="preserve">                               |  HTTP (GET / POST / AJAX)</w:t>
-      </w:r>
-      <w:br/>
-      <w:r>
-        <w:rPr>
-          <w:rFonts w:ascii="Consolas" w:hAnsi="Consolas"/>
-          <w:sz w:val="16"/>
-        </w:rPr>
-        <w:t xml:space="preserve">  +----------------------------v------------------------------+</w:t>
-      </w:r>
-      <w:br/>
-      <w:r>
-        <w:rPr>
-          <w:rFonts w:ascii="Consolas" w:hAnsi="Consolas"/>
-          <w:sz w:val="16"/>
-        </w:rPr>
-        <w:t xml:space="preserve">  |  APPLICATION TIER (Server)                                |</w:t>
-      </w:r>
-      <w:br/>
-      <w:r>
-        <w:rPr>
-          <w:rFonts w:ascii="Consolas" w:hAnsi="Consolas"/>
-          <w:sz w:val="16"/>
-        </w:rPr>
-        <w:t xml:space="preserve">  |  PHP on Apache (XAMPP)                                     |</w:t>
-      </w:r>
-      <w:br/>
-      <w:r>
-        <w:rPr>
-          <w:rFonts w:ascii="Consolas" w:hAnsi="Consolas"/>
-          <w:sz w:val="16"/>
-        </w:rPr>
-        <w:t xml:space="preserve">  |  Auth &amp; sessions - business logic - validation - CRUD     |</w:t>
-      </w:r>
-      <w:br/>
-      <w:r>
-        <w:rPr>
-          <w:rFonts w:ascii="Consolas" w:hAnsi="Consolas"/>
-          <w:sz w:val="16"/>
-        </w:rPr>
-        <w:t xml:space="preserve">  +----------------------------+------------------------------+</w:t>
-      </w:r>
-      <w:br/>
-      <w:r>
-        <w:rPr>
-          <w:rFonts w:ascii="Consolas" w:hAnsi="Consolas"/>
-          <w:sz w:val="16"/>
-        </w:rPr>
-        <w:t xml:space="preserve">                               |  mysqli + prepared statements</w:t>
-      </w:r>
-      <w:br/>
-      <w:r>
-        <w:rPr>
-          <w:rFonts w:ascii="Consolas" w:hAnsi="Consolas"/>
-          <w:sz w:val="16"/>
-        </w:rPr>
-        <w:t xml:space="preserve">  +----------------------------v------------------------------+</w:t>
-      </w:r>
-      <w:br/>
-      <w:r>
-        <w:rPr>
-          <w:rFonts w:ascii="Consolas" w:hAnsi="Consolas"/>
-          <w:sz w:val="16"/>
-        </w:rPr>
-        <w:t xml:space="preserve">  |  DATA TIER                                                |</w:t>
-      </w:r>
-      <w:br/>
-      <w:r>
-        <w:rPr>
-          <w:rFonts w:ascii="Consolas" w:hAnsi="Consolas"/>
-          <w:sz w:val="16"/>
-        </w:rPr>
-        <w:t xml:space="preserve">  |  MySQL database 'sportzone_db' (10 related tables)        |</w:t>
-      </w:r>
-      <w:br/>
-      <w:r>
-        <w:rPr>
-          <w:rFonts w:ascii="Consolas" w:hAnsi="Consolas"/>
-          <w:sz w:val="16"/>
-        </w:rPr>
-        <w:t xml:space="preserve">  +-----------------------------------------------------------+</w:t>
+        <w:jc w:val="center"/>
+        <w:spacing w:before="120" w:after="60"/>
+      </w:pPr>
+      <w:r>
+        <w:drawing>
+          <wp:inline distT="0" distB="0" distL="0" distR="0">
+            <wp:extent cx="3524250" cy="6667500"/>
+            <wp:effectExtent l="0" t="0" r="0" b="0"/>
+            <wp:docPr id="1" name="Picture 1"/>
+            <wp:cNvGraphicFramePr>
+              <a:graphicFrameLocks xmlns:a="http://schemas.openxmlformats.org/drawingml/2006/main" noChangeAspect="1"/>
+            </wp:cNvGraphicFramePr>
+            <a:graphic xmlns:a="http://schemas.openxmlformats.org/drawingml/2006/main">
+              <a:graphicData uri="http://schemas.openxmlformats.org/drawingml/2006/picture">
+                <pic:pic xmlns:pic="http://schemas.openxmlformats.org/drawingml/2006/picture">
+                  <pic:nvPicPr>
+                    <pic:cNvPr id="1" name="image1.png"/>
+                    <pic:cNvPicPr/>
+                  </pic:nvPicPr>
+                  <pic:blipFill>
+                    <a:blip r:embed="rIdImg1"/>
+                    <a:stretch>
+                      <a:fillRect/>
+                    </a:stretch>
+                  </pic:blipFill>
+                  <pic:spPr>
+                    <a:xfrm>
+                      <a:off x="0" y="0"/>
+                      <a:ext cx="3524250" cy="6667500"/>
+                    </a:xfrm>
+                    <a:prstGeom prst="rect">
+                      <a:avLst/>
+                    </a:prstGeom>
+                  </pic:spPr>
+                </pic:pic>
+              </a:graphicData>
+            </a:graphic>
+          </wp:inline>
+        </w:drawing>
+      </w:r>
+    </w:p>
+    <w:p>
+      <w:pPr>
+        <w:spacing w:before="40" w:after="160"/>
+        <w:jc w:val="center"/>
+      </w:pPr>
+      <w:r>
+        <w:rPr>
+          <w:i/>
+          <w:sz w:val="18"/>
+          <w:szCs w:val="18"/>
+          <w:color w:val="666666"/>
+        </w:rPr>
+        <w:t xml:space="preserve">Figure 3.1 - Three-tier system architecture</w:t>
       </w:r>
     </w:p>
     <w:p>
@@ -1772,18 +1697,6 @@
     </w:p>
     <w:p>
       <w:pPr>
-        <w:spacing w:before="40" w:after="80"/>
-      </w:pPr>
-      <w:r>
-        <w:rPr>
-          <w:sz w:val="21"/>
-          <w:szCs w:val="21"/>
-        </w:rPr>
-        <w:t xml:space="preserve">Common code is centralised so every page stays consistent and DRY:</w:t>
-      </w:r>
-    </w:p>
-    <w:p>
-      <w:pPr>
         <w:ind w:left="360" w:hanging="200"/>
         <w:spacing w:before="20" w:after="20"/>
       </w:pPr>
@@ -1859,7 +1772,7 @@
           <w:sz w:val="21"/>
           <w:szCs w:val="21"/>
         </w:rPr>
-        <w:t xml:space="preserve">head.php / header.php / footer.php - shared &lt;head&gt;, navbar/search/category menu, and footer.</w:t>
+        <w:t xml:space="preserve">head.php / header.php / footer.php - shared head, navbar/search/category menu, footer.</w:t>
       </w:r>
     </w:p>
     <w:p>
@@ -2430,144 +2343,65 @@
           <w:szCs w:val="24"/>
           <w:color w:val="2B2D42"/>
         </w:rPr>
-        <w:t xml:space="preserve">4.2 Entity Relationship Diagram (text form)</w:t>
-      </w:r>
-    </w:p>
-    <w:p>
-      <w:pPr>
-        <w:spacing w:before="40" w:after="80"/>
-      </w:pPr>
-      <w:r>
-        <w:rPr>
-          <w:sz w:val="21"/>
-          <w:szCs w:val="21"/>
-        </w:rPr>
-        <w:t xml:space="preserve">A visual ERD can be exported from phpMyAdmin (Designer view); the relationships are shown below.</w:t>
-      </w:r>
-    </w:p>
-    <w:p>
-      <w:pPr>
-        <w:spacing w:before="60" w:after="120"/>
-        <w:shd w:val="clear" w:fill="F4F5F7"/>
-      </w:pPr>
-      <w:r>
-        <w:rPr>
-          <w:rFonts w:ascii="Consolas" w:hAnsi="Consolas"/>
-          <w:sz w:val="16"/>
-        </w:rPr>
-        <w:t xml:space="preserve"> CATEGORIES 1----* PRODUCTS</w:t>
-      </w:r>
-      <w:br/>
-      <w:r>
-        <w:rPr>
-          <w:rFonts w:ascii="Consolas" w:hAnsi="Consolas"/>
-          <w:sz w:val="16"/>
-        </w:rPr>
-        <w:t xml:space="preserve">                     |  *            * \ </w:t>
-      </w:r>
-      <w:br/>
-      <w:r>
-        <w:rPr>
-          <w:rFonts w:ascii="Consolas" w:hAnsi="Consolas"/>
-          <w:sz w:val="16"/>
-        </w:rPr>
-        <w:t xml:space="preserve">                     |   \            \ \</w:t>
-      </w:r>
-      <w:br/>
-      <w:r>
-        <w:rPr>
-          <w:rFonts w:ascii="Consolas" w:hAnsi="Consolas"/>
-          <w:sz w:val="16"/>
-        </w:rPr>
-        <w:t xml:space="preserve"> USERS 1----* ORDERS 1----* ORDER_ITEMS *----1 PRODUCTS</w:t>
-      </w:r>
-      <w:br/>
-      <w:r>
-        <w:rPr>
-          <w:rFonts w:ascii="Consolas" w:hAnsi="Consolas"/>
-          <w:sz w:val="16"/>
-        </w:rPr>
-        <w:t xml:space="preserve">   | 1                                  </w:t>
-      </w:r>
-      <w:br/>
-      <w:r>
-        <w:rPr>
-          <w:rFonts w:ascii="Consolas" w:hAnsi="Consolas"/>
-          <w:sz w:val="16"/>
-        </w:rPr>
-        <w:t xml:space="preserve">   |----* REVIEWS  *--------------------1 PRODUCTS</w:t>
-      </w:r>
-      <w:br/>
-      <w:r>
-        <w:rPr>
-          <w:rFonts w:ascii="Consolas" w:hAnsi="Consolas"/>
-          <w:sz w:val="16"/>
-        </w:rPr>
-        <w:t xml:space="preserve">   | 1                                  </w:t>
-      </w:r>
-      <w:br/>
-      <w:r>
-        <w:rPr>
-          <w:rFonts w:ascii="Consolas" w:hAnsi="Consolas"/>
-          <w:sz w:val="16"/>
-        </w:rPr>
-        <w:t xml:space="preserve">   |----* CART     *--------------------1 PRODUCTS</w:t>
-      </w:r>
-      <w:br/>
-      <w:r>
-        <w:rPr>
-          <w:rFonts w:ascii="Consolas" w:hAnsi="Consolas"/>
-          <w:sz w:val="16"/>
-        </w:rPr>
-        <w:t xml:space="preserve">   | 1                                  </w:t>
-      </w:r>
-      <w:br/>
-      <w:r>
-        <w:rPr>
-          <w:rFonts w:ascii="Consolas" w:hAnsi="Consolas"/>
-          <w:sz w:val="16"/>
-        </w:rPr>
-        <w:t xml:space="preserve">   |----* WISHLIST *--------------------1 PRODUCTS</w:t>
-      </w:r>
-      <w:br/>
-      <w:r>
-        <w:rPr>
-          <w:rFonts w:ascii="Consolas" w:hAnsi="Consolas"/>
-          <w:sz w:val="16"/>
-        </w:rPr>
-        <w:t xml:space="preserve"/>
-      </w:r>
-      <w:br/>
-      <w:r>
-        <w:rPr>
-          <w:rFonts w:ascii="Consolas" w:hAnsi="Consolas"/>
-          <w:sz w:val="16"/>
-        </w:rPr>
-        <w:t xml:space="preserve"> PROMO_CODES .... referenced by 'discount_code' on ORDERS</w:t>
-      </w:r>
-      <w:br/>
-      <w:r>
-        <w:rPr>
-          <w:rFonts w:ascii="Consolas" w:hAnsi="Consolas"/>
-          <w:sz w:val="16"/>
-        </w:rPr>
-        <w:t xml:space="preserve"> CONTACT_MESSAGES .... standalone (no foreign keys)</w:t>
-      </w:r>
-      <w:br/>
-      <w:r>
-        <w:rPr>
-          <w:rFonts w:ascii="Consolas" w:hAnsi="Consolas"/>
-          <w:sz w:val="16"/>
-        </w:rPr>
-        <w:t xml:space="preserve"/>
-      </w:r>
-      <w:br/>
-      <w:r>
-        <w:rPr>
-          <w:rFonts w:ascii="Consolas" w:hAnsi="Consolas"/>
-          <w:sz w:val="16"/>
-        </w:rPr>
-        <w:t xml:space="preserve"> Legend:  1----*  = one-to-many      FK = foreign key</w:t>
+        <w:t xml:space="preserve">4.2 Entity Relationship Diagram</w:t>
+      </w:r>
+    </w:p>
+    <w:p>
+      <w:pPr>
+        <w:jc w:val="center"/>
+        <w:spacing w:before="120" w:after="60"/>
+      </w:pPr>
+      <w:r>
+        <w:drawing>
+          <wp:inline distT="0" distB="0" distL="0" distR="0">
+            <wp:extent cx="5715000" cy="3600450"/>
+            <wp:effectExtent l="0" t="0" r="0" b="0"/>
+            <wp:docPr id="2" name="Picture 2"/>
+            <wp:cNvGraphicFramePr>
+              <a:graphicFrameLocks xmlns:a="http://schemas.openxmlformats.org/drawingml/2006/main" noChangeAspect="1"/>
+            </wp:cNvGraphicFramePr>
+            <a:graphic xmlns:a="http://schemas.openxmlformats.org/drawingml/2006/main">
+              <a:graphicData uri="http://schemas.openxmlformats.org/drawingml/2006/picture">
+                <pic:pic xmlns:pic="http://schemas.openxmlformats.org/drawingml/2006/picture">
+                  <pic:nvPicPr>
+                    <pic:cNvPr id="2" name="image2.png"/>
+                    <pic:cNvPicPr/>
+                  </pic:nvPicPr>
+                  <pic:blipFill>
+                    <a:blip r:embed="rIdImg2"/>
+                    <a:stretch>
+                      <a:fillRect/>
+                    </a:stretch>
+                  </pic:blipFill>
+                  <pic:spPr>
+                    <a:xfrm>
+                      <a:off x="0" y="0"/>
+                      <a:ext cx="5715000" cy="3600450"/>
+                    </a:xfrm>
+                    <a:prstGeom prst="rect">
+                      <a:avLst/>
+                    </a:prstGeom>
+                  </pic:spPr>
+                </pic:pic>
+              </a:graphicData>
+            </a:graphic>
+          </wp:inline>
+        </w:drawing>
+      </w:r>
+    </w:p>
+    <w:p>
+      <w:pPr>
+        <w:spacing w:before="40" w:after="160"/>
+        <w:jc w:val="center"/>
+      </w:pPr>
+      <w:r>
+        <w:rPr>
+          <w:i/>
+          <w:sz w:val="18"/>
+          <w:szCs w:val="18"/>
+          <w:color w:val="666666"/>
+        </w:rPr>
+        <w:t xml:space="preserve">Figure 4.1 - Entity Relationship Diagram (sportzone_db)</w:t>
       </w:r>
     </w:p>
     <w:p>
@@ -2602,7 +2436,7 @@
           <w:sz w:val="21"/>
           <w:szCs w:val="21"/>
         </w:rPr>
-        <w:t xml:space="preserve">One category has many products (categories 1 - * products).</w:t>
+        <w:t xml:space="preserve">One category has many products.</w:t>
       </w:r>
     </w:p>
     <w:p>
@@ -2662,7 +2496,7 @@
           <w:sz w:val="21"/>
           <w:szCs w:val="21"/>
         </w:rPr>
-        <w:t xml:space="preserve">One user has many cart rows and many wishlist rows; each refers to one product.</w:t>
+        <w:t xml:space="preserve">One user has many cart and wishlist rows; each refers to one product.</w:t>
       </w:r>
     </w:p>
     <w:p>
@@ -2757,7 +2591,7 @@
           <w:sz w:val="21"/>
           <w:szCs w:val="21"/>
         </w:rPr>
-        <w:t xml:space="preserve">3NF: no transitive dependencies; product details live in products, category details in categories, and orders reference users by user_id rather than duplicating their data.</w:t>
+        <w:t xml:space="preserve">3NF: no transitive dependencies; product details live in products, category details in categories, orders reference users by user_id.</w:t>
       </w:r>
     </w:p>
     <w:p>
@@ -2769,7 +2603,7 @@
           <w:sz w:val="21"/>
           <w:szCs w:val="21"/>
         </w:rPr>
-        <w:t xml:space="preserve">Deliberate denormalization: order_items stores product_name and price at purchase time, so historical orders stay accurate even if a product is later renamed, repriced or deleted (the foreign key uses ON DELETE SET NULL). This is standard e-commerce practice.</w:t>
+        <w:t xml:space="preserve">Deliberate denormalization: order_items stores product_name and price at purchase time, so historical orders stay accurate even if a product is later renamed, repriced or deleted (the foreign key uses ON DELETE SET NULL).</w:t>
       </w:r>
     </w:p>
     <w:p>
@@ -2844,7 +2678,7 @@
           <w:sz w:val="21"/>
           <w:szCs w:val="21"/>
         </w:rPr>
-        <w:t xml:space="preserve">A CHECK constraint restricts reviews.rating to a value between 1 and 5.</w:t>
+        <w:t xml:space="preserve">A CHECK constraint restricts reviews.rating to 1-5.</w:t>
       </w:r>
     </w:p>
     <w:p>
@@ -2923,47 +2757,47 @@
           <w:sz w:val="21"/>
           <w:szCs w:val="21"/>
         </w:rPr>
-        <w:t xml:space="preserve">Registration validates on the server (name, valid email, password length and match, terms) and checks email uniqueness with a prepared statement; passwords are hashed with password_hash(). JavaScript adds real-time feedback.</w:t>
-      </w:r>
-    </w:p>
-    <w:p>
-      <w:pPr>
-        <w:ind w:left="360" w:hanging="200"/>
-        <w:spacing w:before="20" w:after="20"/>
-      </w:pPr>
-      <w:r>
-        <w:rPr>
-          <w:sz w:val="21"/>
-          <w:szCs w:val="21"/>
-        </w:rPr>
-        <w:t xml:space="preserve">•  </w:t>
-      </w:r>
-      <w:r>
-        <w:rPr>
-          <w:sz w:val="21"/>
-          <w:szCs w:val="21"/>
-        </w:rPr>
-        <w:t xml:space="preserve">Login verifies credentials with password_verify(), checks account status, regenerates the session ID (prevents session fixation) and redirects by role.</w:t>
-      </w:r>
-    </w:p>
-    <w:p>
-      <w:pPr>
-        <w:ind w:left="360" w:hanging="200"/>
-        <w:spacing w:before="20" w:after="20"/>
-      </w:pPr>
-      <w:r>
-        <w:rPr>
-          <w:sz w:val="21"/>
-          <w:szCs w:val="21"/>
-        </w:rPr>
-        <w:t xml:space="preserve">•  </w:t>
-      </w:r>
-      <w:r>
-        <w:rPr>
-          <w:sz w:val="21"/>
-          <w:szCs w:val="21"/>
-        </w:rPr>
-        <w:t xml:space="preserve">Profile lets the user edit their details and change their password (re-checking the current password first).</w:t>
+        <w:t xml:space="preserve">Registration validates on the server and checks email uniqueness with a prepared statement; passwords are hashed with password_hash(). JavaScript adds real-time feedback.</w:t>
+      </w:r>
+    </w:p>
+    <w:p>
+      <w:pPr>
+        <w:ind w:left="360" w:hanging="200"/>
+        <w:spacing w:before="20" w:after="20"/>
+      </w:pPr>
+      <w:r>
+        <w:rPr>
+          <w:sz w:val="21"/>
+          <w:szCs w:val="21"/>
+        </w:rPr>
+        <w:t xml:space="preserve">•  </w:t>
+      </w:r>
+      <w:r>
+        <w:rPr>
+          <w:sz w:val="21"/>
+          <w:szCs w:val="21"/>
+        </w:rPr>
+        <w:t xml:space="preserve">Login verifies credentials with password_verify(), checks status, regenerates the session ID and redirects by role.</w:t>
+      </w:r>
+    </w:p>
+    <w:p>
+      <w:pPr>
+        <w:ind w:left="360" w:hanging="200"/>
+        <w:spacing w:before="20" w:after="20"/>
+      </w:pPr>
+      <w:r>
+        <w:rPr>
+          <w:sz w:val="21"/>
+          <w:szCs w:val="21"/>
+        </w:rPr>
+        <w:t xml:space="preserve">•  </w:t>
+      </w:r>
+      <w:r>
+        <w:rPr>
+          <w:sz w:val="21"/>
+          <w:szCs w:val="21"/>
+        </w:rPr>
+        <w:t xml:space="preserve">Profile lets the user edit details and change password (re-checking the current password first).</w:t>
       </w:r>
     </w:p>
     <w:p>
@@ -3010,7 +2844,7 @@
           <w:sz w:val="21"/>
           <w:szCs w:val="21"/>
         </w:rPr>
-        <w:t xml:space="preserve">Listing supports keyword search, category/brand/price filters, sorting (newest, best selling, top rated, price, name) and pagination - all built with a parameterised SQL query.</w:t>
+        <w:t xml:space="preserve">Listing supports keyword search, category/brand/price filters, sorting (newest, best selling, top rated, price, name) and pagination - all via a parameterised SQL query.</w:t>
       </w:r>
     </w:p>
     <w:p>
@@ -3050,7 +2884,7 @@
           <w:sz w:val="21"/>
           <w:szCs w:val="21"/>
         </w:rPr>
-        <w:t xml:space="preserve">Reviews are verified-purchase only: a customer can review a product only after buying it, and only once. Reviews from buyers show a "Verified Purchase" badge.</w:t>
+        <w:t xml:space="preserve">Reviews are verified-purchase only and once-per-product; buyers show a "Verified Purchase" badge.</w:t>
       </w:r>
     </w:p>
     <w:p>
@@ -3097,47 +2931,47 @@
           <w:sz w:val="21"/>
           <w:szCs w:val="21"/>
         </w:rPr>
-        <w:t xml:space="preserve">Cart is stored per user (add, update quantity, remove, clear) with live totals and stock clamping.</w:t>
-      </w:r>
-    </w:p>
-    <w:p>
-      <w:pPr>
-        <w:ind w:left="360" w:hanging="200"/>
-        <w:spacing w:before="20" w:after="20"/>
-      </w:pPr>
-      <w:r>
-        <w:rPr>
-          <w:sz w:val="21"/>
-          <w:szCs w:val="21"/>
-        </w:rPr>
-        <w:t xml:space="preserve">•  </w:t>
-      </w:r>
-      <w:r>
-        <w:rPr>
-          <w:sz w:val="21"/>
-          <w:szCs w:val="21"/>
-        </w:rPr>
-        <w:t xml:space="preserve">Checkout is a multi-step form (Shipping, Payment, Review) with client- and server-side validation, and supports promo codes (validated on the server). Order creation runs inside a transaction that inserts the order and items, decrements stock and clears the cart - rolling back on error.</w:t>
-      </w:r>
-    </w:p>
-    <w:p>
-      <w:pPr>
-        <w:ind w:left="360" w:hanging="200"/>
-        <w:spacing w:before="20" w:after="20"/>
-      </w:pPr>
-      <w:r>
-        <w:rPr>
-          <w:sz w:val="21"/>
-          <w:szCs w:val="21"/>
-        </w:rPr>
-        <w:t xml:space="preserve">•  </w:t>
-      </w:r>
-      <w:r>
-        <w:rPr>
-          <w:sz w:val="21"/>
-          <w:szCs w:val="21"/>
-        </w:rPr>
-        <w:t xml:space="preserve">Order tracking lists the customer's orders with status badges and a details modal, and lets them cancel an order while it is still Pending (which restores stock).</w:t>
+        <w:t xml:space="preserve">Cart is stored per user with live totals and stock clamping.</w:t>
+      </w:r>
+    </w:p>
+    <w:p>
+      <w:pPr>
+        <w:ind w:left="360" w:hanging="200"/>
+        <w:spacing w:before="20" w:after="20"/>
+      </w:pPr>
+      <w:r>
+        <w:rPr>
+          <w:sz w:val="21"/>
+          <w:szCs w:val="21"/>
+        </w:rPr>
+        <w:t xml:space="preserve">•  </w:t>
+      </w:r>
+      <w:r>
+        <w:rPr>
+          <w:sz w:val="21"/>
+          <w:szCs w:val="21"/>
+        </w:rPr>
+        <w:t xml:space="preserve">Checkout is a multi-step form with client/server validation and promo-code support (validated server-side). Order creation runs in a transaction that inserts the order and items, decrements stock and clears the cart.</w:t>
+      </w:r>
+    </w:p>
+    <w:p>
+      <w:pPr>
+        <w:ind w:left="360" w:hanging="200"/>
+        <w:spacing w:before="20" w:after="20"/>
+      </w:pPr>
+      <w:r>
+        <w:rPr>
+          <w:sz w:val="21"/>
+          <w:szCs w:val="21"/>
+        </w:rPr>
+        <w:t xml:space="preserve">•  </w:t>
+      </w:r>
+      <w:r>
+        <w:rPr>
+          <w:sz w:val="21"/>
+          <w:szCs w:val="21"/>
+        </w:rPr>
+        <w:t xml:space="preserve">Order tracking lists orders with status badges and a details modal, and allows cancelling a Pending order (which restores stock).</w:t>
       </w:r>
     </w:p>
     <w:p>
@@ -3184,47 +3018,47 @@
           <w:sz w:val="21"/>
           <w:szCs w:val="21"/>
         </w:rPr>
-        <w:t xml:space="preserve">Dashboard shows totals (products, customers, orders, revenue), a custom canvas sales chart, recent orders and low-stock alerts.</w:t>
-      </w:r>
-    </w:p>
-    <w:p>
-      <w:pPr>
-        <w:ind w:left="360" w:hanging="200"/>
-        <w:spacing w:before="20" w:after="20"/>
-      </w:pPr>
-      <w:r>
-        <w:rPr>
-          <w:sz w:val="21"/>
-          <w:szCs w:val="21"/>
-        </w:rPr>
-        <w:t xml:space="preserve">•  </w:t>
-      </w:r>
-      <w:r>
-        <w:rPr>
-          <w:sz w:val="21"/>
-          <w:szCs w:val="21"/>
-        </w:rPr>
-        <w:t xml:space="preserve">Product CRUD supports create/read/update/delete with secure image upload (MIME-checked, size-limited, randomised filename) and live preview.</w:t>
-      </w:r>
-    </w:p>
-    <w:p>
-      <w:pPr>
-        <w:ind w:left="360" w:hanging="200"/>
-        <w:spacing w:before="20" w:after="20"/>
-      </w:pPr>
-      <w:r>
-        <w:rPr>
-          <w:sz w:val="21"/>
-          <w:szCs w:val="21"/>
-        </w:rPr>
-        <w:t xml:space="preserve">•  </w:t>
-      </w:r>
-      <w:r>
-        <w:rPr>
-          <w:sz w:val="21"/>
-          <w:szCs w:val="21"/>
-        </w:rPr>
-        <w:t xml:space="preserve">Order management lists and filters orders and updates their status; category, user and contact-message modules complete the panel. All admin pages are protected by require_admin().</w:t>
+        <w:t xml:space="preserve">Dashboard shows totals, a custom canvas sales chart, recent orders and low-stock alerts.</w:t>
+      </w:r>
+    </w:p>
+    <w:p>
+      <w:pPr>
+        <w:ind w:left="360" w:hanging="200"/>
+        <w:spacing w:before="20" w:after="20"/>
+      </w:pPr>
+      <w:r>
+        <w:rPr>
+          <w:sz w:val="21"/>
+          <w:szCs w:val="21"/>
+        </w:rPr>
+        <w:t xml:space="preserve">•  </w:t>
+      </w:r>
+      <w:r>
+        <w:rPr>
+          <w:sz w:val="21"/>
+          <w:szCs w:val="21"/>
+        </w:rPr>
+        <w:t xml:space="preserve">Product CRUD with secure image upload (MIME-checked, size-limited, randomised filename) and live preview.</w:t>
+      </w:r>
+    </w:p>
+    <w:p>
+      <w:pPr>
+        <w:ind w:left="360" w:hanging="200"/>
+        <w:spacing w:before="20" w:after="20"/>
+      </w:pPr>
+      <w:r>
+        <w:rPr>
+          <w:sz w:val="21"/>
+          <w:szCs w:val="21"/>
+        </w:rPr>
+        <w:t xml:space="preserve">•  </w:t>
+      </w:r>
+      <w:r>
+        <w:rPr>
+          <w:sz w:val="21"/>
+          <w:szCs w:val="21"/>
+        </w:rPr>
+        <w:t xml:space="preserve">Order management lists/filters orders and updates status; category, user and message modules complete the panel. All admin pages use require_admin().</w:t>
       </w:r>
     </w:p>
     <w:p>
@@ -3276,159 +3110,60 @@
     </w:p>
     <w:p>
       <w:pPr>
-        <w:spacing w:before="60" w:after="120"/>
-        <w:shd w:val="clear" w:fill="F4F5F7"/>
-      </w:pPr>
-      <w:r>
-        <w:rPr>
-          <w:rFonts w:ascii="Consolas" w:hAnsi="Consolas"/>
-          <w:sz w:val="16"/>
-        </w:rPr>
-        <w:t xml:space="preserve">   +-------------------------------------------------------+</w:t>
-      </w:r>
-      <w:br/>
-      <w:r>
-        <w:rPr>
-          <w:rFonts w:ascii="Consolas" w:hAnsi="Consolas"/>
-          <w:sz w:val="16"/>
-        </w:rPr>
-        <w:t xml:space="preserve">   |                   SPORTZONE  SYSTEM                   |</w:t>
-      </w:r>
-      <w:br/>
-      <w:r>
-        <w:rPr>
-          <w:rFonts w:ascii="Consolas" w:hAnsi="Consolas"/>
-          <w:sz w:val="16"/>
-        </w:rPr>
-        <w:t xml:space="preserve">   |                                                       |</w:t>
-      </w:r>
-      <w:br/>
-      <w:r>
-        <w:rPr>
-          <w:rFonts w:ascii="Consolas" w:hAnsi="Consolas"/>
-          <w:sz w:val="16"/>
-        </w:rPr>
-        <w:t xml:space="preserve">   |   ( Register / Login )                                |</w:t>
-      </w:r>
-      <w:br/>
-      <w:r>
-        <w:rPr>
-          <w:rFonts w:ascii="Consolas" w:hAnsi="Consolas"/>
-          <w:sz w:val="16"/>
-        </w:rPr>
-        <w:t xml:space="preserve">   |   ( Browse / Search / Filter / Sort products )        |</w:t>
-      </w:r>
-      <w:br/>
-      <w:r>
-        <w:rPr>
-          <w:rFonts w:ascii="Consolas" w:hAnsi="Consolas"/>
-          <w:sz w:val="16"/>
-        </w:rPr>
-        <w:t xml:space="preserve">   |   ( View product details &amp; reviews )                  |</w:t>
-      </w:r>
-      <w:br/>
-      <w:r>
-        <w:rPr>
-          <w:rFonts w:ascii="Consolas" w:hAnsi="Consolas"/>
-          <w:sz w:val="16"/>
-        </w:rPr>
-        <w:t xml:space="preserve">   |   ( Add to Cart )      ( Add to Wishlist )            |</w:t>
-      </w:r>
-      <w:br/>
-      <w:r>
-        <w:rPr>
-          <w:rFonts w:ascii="Consolas" w:hAnsi="Consolas"/>
-          <w:sz w:val="16"/>
-        </w:rPr>
-        <w:t xml:space="preserve">   |   ( Apply promo code ) ( Checkout / Place order )     |</w:t>
-      </w:r>
-      <w:br/>
-      <w:r>
-        <w:rPr>
-          <w:rFonts w:ascii="Consolas" w:hAnsi="Consolas"/>
-          <w:sz w:val="16"/>
-        </w:rPr>
-        <w:t xml:space="preserve">   |   ( Track order )      ( Cancel pending order )       |</w:t>
-      </w:r>
-      <w:br/>
-      <w:r>
-        <w:rPr>
-          <w:rFonts w:ascii="Consolas" w:hAnsi="Consolas"/>
-          <w:sz w:val="16"/>
-        </w:rPr>
-        <w:t xml:space="preserve">   |   ( Write verified review )  ( Contact us )           |</w:t>
-      </w:r>
-      <w:br/>
-      <w:r>
-        <w:rPr>
-          <w:rFonts w:ascii="Consolas" w:hAnsi="Consolas"/>
-          <w:sz w:val="16"/>
-        </w:rPr>
-        <w:t xml:space="preserve">   |                                                       |</w:t>
-      </w:r>
-      <w:br/>
-      <w:r>
-        <w:rPr>
-          <w:rFonts w:ascii="Consolas" w:hAnsi="Consolas"/>
-          <w:sz w:val="16"/>
-        </w:rPr>
-        <w:t xml:space="preserve">   |   ====================  ADMIN  ======================  |</w:t>
-      </w:r>
-      <w:br/>
-      <w:r>
-        <w:rPr>
-          <w:rFonts w:ascii="Consolas" w:hAnsi="Consolas"/>
-          <w:sz w:val="16"/>
-        </w:rPr>
-        <w:t xml:space="preserve">   |   ( Manage products CRUD )  ( Manage categories )     |</w:t>
-      </w:r>
-      <w:br/>
-      <w:r>
-        <w:rPr>
-          <w:rFonts w:ascii="Consolas" w:hAnsi="Consolas"/>
-          <w:sz w:val="16"/>
-        </w:rPr>
-        <w:t xml:space="preserve">   |   ( Manage orders / status ) ( Manage users )         |</w:t>
-      </w:r>
-      <w:br/>
-      <w:r>
-        <w:rPr>
-          <w:rFonts w:ascii="Consolas" w:hAnsi="Consolas"/>
-          <w:sz w:val="16"/>
-        </w:rPr>
-        <w:t xml:space="preserve">   |   ( View dashboard analytics ) ( View messages )      |</w:t>
-      </w:r>
-      <w:br/>
-      <w:r>
-        <w:rPr>
-          <w:rFonts w:ascii="Consolas" w:hAnsi="Consolas"/>
-          <w:sz w:val="16"/>
-        </w:rPr>
-        <w:t xml:space="preserve">   +-------------------------------------------------------+</w:t>
-      </w:r>
-      <w:br/>
-      <w:r>
-        <w:rPr>
-          <w:rFonts w:ascii="Consolas" w:hAnsi="Consolas"/>
-          <w:sz w:val="16"/>
-        </w:rPr>
-        <w:t xml:space="preserve"/>
-      </w:r>
-      <w:br/>
-      <w:r>
-        <w:rPr>
-          <w:rFonts w:ascii="Consolas" w:hAnsi="Consolas"/>
-          <w:sz w:val="16"/>
-        </w:rPr>
-        <w:t xml:space="preserve">   Customer  -----&gt;  customer use cases (top group)</w:t>
-      </w:r>
-      <w:br/>
-      <w:r>
-        <w:rPr>
-          <w:rFonts w:ascii="Consolas" w:hAnsi="Consolas"/>
-          <w:sz w:val="16"/>
-        </w:rPr>
-        <w:t xml:space="preserve">   Admin     -----&gt;  admin use cases (bottom group)</w:t>
+        <w:jc w:val="center"/>
+        <w:spacing w:before="120" w:after="60"/>
+      </w:pPr>
+      <w:r>
+        <w:drawing>
+          <wp:inline distT="0" distB="0" distL="0" distR="0">
+            <wp:extent cx="4019550" cy="12230100"/>
+            <wp:effectExtent l="0" t="0" r="0" b="0"/>
+            <wp:docPr id="3" name="Picture 3"/>
+            <wp:cNvGraphicFramePr>
+              <a:graphicFrameLocks xmlns:a="http://schemas.openxmlformats.org/drawingml/2006/main" noChangeAspect="1"/>
+            </wp:cNvGraphicFramePr>
+            <a:graphic xmlns:a="http://schemas.openxmlformats.org/drawingml/2006/main">
+              <a:graphicData uri="http://schemas.openxmlformats.org/drawingml/2006/picture">
+                <pic:pic xmlns:pic="http://schemas.openxmlformats.org/drawingml/2006/picture">
+                  <pic:nvPicPr>
+                    <pic:cNvPr id="3" name="image3.png"/>
+                    <pic:cNvPicPr/>
+                  </pic:nvPicPr>
+                  <pic:blipFill>
+                    <a:blip r:embed="rIdImg3"/>
+                    <a:stretch>
+                      <a:fillRect/>
+                    </a:stretch>
+                  </pic:blipFill>
+                  <pic:spPr>
+                    <a:xfrm>
+                      <a:off x="0" y="0"/>
+                      <a:ext cx="4019550" cy="12230100"/>
+                    </a:xfrm>
+                    <a:prstGeom prst="rect">
+                      <a:avLst/>
+                    </a:prstGeom>
+                  </pic:spPr>
+                </pic:pic>
+              </a:graphicData>
+            </a:graphic>
+          </wp:inline>
+        </w:drawing>
+      </w:r>
+    </w:p>
+    <w:p>
+      <w:pPr>
+        <w:spacing w:before="40" w:after="160"/>
+        <w:jc w:val="center"/>
+      </w:pPr>
+      <w:r>
+        <w:rPr>
+          <w:i/>
+          <w:sz w:val="18"/>
+          <w:szCs w:val="18"/>
+          <w:color w:val="666666"/>
+        </w:rPr>
+        <w:t xml:space="preserve">Figure 6.1 - Use case diagram</w:t>
       </w:r>
     </w:p>
     <w:p>
@@ -3448,119 +3183,60 @@
     </w:p>
     <w:p>
       <w:pPr>
-        <w:spacing w:before="60" w:after="120"/>
-        <w:shd w:val="clear" w:fill="F4F5F7"/>
-      </w:pPr>
-      <w:r>
-        <w:rPr>
-          <w:rFonts w:ascii="Consolas" w:hAnsi="Consolas"/>
-          <w:sz w:val="16"/>
-        </w:rPr>
-        <w:t xml:space="preserve">   +----------+   orders / reviews / messages   +------------+</w:t>
-      </w:r>
-      <w:br/>
-      <w:r>
-        <w:rPr>
-          <w:rFonts w:ascii="Consolas" w:hAnsi="Consolas"/>
-          <w:sz w:val="16"/>
-        </w:rPr>
-        <w:t xml:space="preserve">   | CUSTOMER | ------------------------------&gt;  |            |</w:t>
-      </w:r>
-      <w:br/>
-      <w:r>
-        <w:rPr>
-          <w:rFonts w:ascii="Consolas" w:hAnsi="Consolas"/>
-          <w:sz w:val="16"/>
-        </w:rPr>
-        <w:t xml:space="preserve">   |          | &lt;------ pages / confirmations -- |  SPORTZONE |</w:t>
-      </w:r>
-      <w:br/>
-      <w:r>
-        <w:rPr>
-          <w:rFonts w:ascii="Consolas" w:hAnsi="Consolas"/>
-          <w:sz w:val="16"/>
-        </w:rPr>
-        <w:t xml:space="preserve">   +----------+                                  |   SYSTEM   |</w:t>
-      </w:r>
-      <w:br/>
-      <w:r>
-        <w:rPr>
-          <w:rFonts w:ascii="Consolas" w:hAnsi="Consolas"/>
-          <w:sz w:val="16"/>
-        </w:rPr>
-        <w:t xml:space="preserve">   +----------+   manage products / orders ----&gt; |    (0)     |</w:t>
-      </w:r>
-      <w:br/>
-      <w:r>
-        <w:rPr>
-          <w:rFonts w:ascii="Consolas" w:hAnsi="Consolas"/>
-          <w:sz w:val="16"/>
-        </w:rPr>
-        <w:t xml:space="preserve">   |  ADMIN   | ------------------------------&gt;  |            |</w:t>
-      </w:r>
-      <w:br/>
-      <w:r>
-        <w:rPr>
-          <w:rFonts w:ascii="Consolas" w:hAnsi="Consolas"/>
-          <w:sz w:val="16"/>
-        </w:rPr>
-        <w:t xml:space="preserve">   |          | &lt;------ dashboards / reports --- |            |</w:t>
-      </w:r>
-      <w:br/>
-      <w:r>
-        <w:rPr>
-          <w:rFonts w:ascii="Consolas" w:hAnsi="Consolas"/>
-          <w:sz w:val="16"/>
-        </w:rPr>
-        <w:t xml:space="preserve">   +----------+                                  +-----+------+</w:t>
-      </w:r>
-      <w:br/>
-      <w:r>
-        <w:rPr>
-          <w:rFonts w:ascii="Consolas" w:hAnsi="Consolas"/>
-          <w:sz w:val="16"/>
-        </w:rPr>
-        <w:t xml:space="preserve">                                                       |</w:t>
-      </w:r>
-      <w:br/>
-      <w:r>
-        <w:rPr>
-          <w:rFonts w:ascii="Consolas" w:hAnsi="Consolas"/>
-          <w:sz w:val="16"/>
-        </w:rPr>
-        <w:t xml:space="preserve">                                          read / write |</w:t>
-      </w:r>
-      <w:br/>
-      <w:r>
-        <w:rPr>
-          <w:rFonts w:ascii="Consolas" w:hAnsi="Consolas"/>
-          <w:sz w:val="16"/>
-        </w:rPr>
-        <w:t xml:space="preserve">                                                       v</w:t>
-      </w:r>
-      <w:br/>
-      <w:r>
-        <w:rPr>
-          <w:rFonts w:ascii="Consolas" w:hAnsi="Consolas"/>
-          <w:sz w:val="16"/>
-        </w:rPr>
-        <w:t xml:space="preserve">                                              +-----------------+</w:t>
-      </w:r>
-      <w:br/>
-      <w:r>
-        <w:rPr>
-          <w:rFonts w:ascii="Consolas" w:hAnsi="Consolas"/>
-          <w:sz w:val="16"/>
-        </w:rPr>
-        <w:t xml:space="preserve">                                              | MySQL  DATABASE |</w:t>
-      </w:r>
-      <w:br/>
-      <w:r>
-        <w:rPr>
-          <w:rFonts w:ascii="Consolas" w:hAnsi="Consolas"/>
-          <w:sz w:val="16"/>
-        </w:rPr>
-        <w:t xml:space="preserve">                                              +-----------------+</w:t>
+        <w:jc w:val="center"/>
+        <w:spacing w:before="120" w:after="60"/>
+      </w:pPr>
+      <w:r>
+        <w:drawing>
+          <wp:inline distT="0" distB="0" distL="0" distR="0">
+            <wp:extent cx="5334000" cy="1209675"/>
+            <wp:effectExtent l="0" t="0" r="0" b="0"/>
+            <wp:docPr id="4" name="Picture 4"/>
+            <wp:cNvGraphicFramePr>
+              <a:graphicFrameLocks xmlns:a="http://schemas.openxmlformats.org/drawingml/2006/main" noChangeAspect="1"/>
+            </wp:cNvGraphicFramePr>
+            <a:graphic xmlns:a="http://schemas.openxmlformats.org/drawingml/2006/main">
+              <a:graphicData uri="http://schemas.openxmlformats.org/drawingml/2006/picture">
+                <pic:pic xmlns:pic="http://schemas.openxmlformats.org/drawingml/2006/picture">
+                  <pic:nvPicPr>
+                    <pic:cNvPr id="4" name="image4.png"/>
+                    <pic:cNvPicPr/>
+                  </pic:nvPicPr>
+                  <pic:blipFill>
+                    <a:blip r:embed="rIdImg4"/>
+                    <a:stretch>
+                      <a:fillRect/>
+                    </a:stretch>
+                  </pic:blipFill>
+                  <pic:spPr>
+                    <a:xfrm>
+                      <a:off x="0" y="0"/>
+                      <a:ext cx="5334000" cy="1209675"/>
+                    </a:xfrm>
+                    <a:prstGeom prst="rect">
+                      <a:avLst/>
+                    </a:prstGeom>
+                  </pic:spPr>
+                </pic:pic>
+              </a:graphicData>
+            </a:graphic>
+          </wp:inline>
+        </w:drawing>
+      </w:r>
+    </w:p>
+    <w:p>
+      <w:pPr>
+        <w:spacing w:before="40" w:after="160"/>
+        <w:jc w:val="center"/>
+      </w:pPr>
+      <w:r>
+        <w:rPr>
+          <w:i/>
+          <w:sz w:val="18"/>
+          <w:szCs w:val="18"/>
+          <w:color w:val="666666"/>
+        </w:rPr>
+        <w:t xml:space="preserve">Figure 6.2 - Context diagram (Level 0 DFD)</w:t>
       </w:r>
     </w:p>
     <w:p>
@@ -3575,112 +3251,65 @@
           <w:szCs w:val="24"/>
           <w:color w:val="2B2D42"/>
         </w:rPr>
-        <w:t xml:space="preserve">6.3 DFD Level 1 (main processes &amp; data stores)</w:t>
-      </w:r>
-    </w:p>
-    <w:p>
-      <w:pPr>
-        <w:spacing w:before="60" w:after="120"/>
-        <w:shd w:val="clear" w:fill="F4F5F7"/>
-      </w:pPr>
-      <w:r>
-        <w:rPr>
-          <w:rFonts w:ascii="Consolas" w:hAnsi="Consolas"/>
-          <w:sz w:val="16"/>
-        </w:rPr>
-        <w:t xml:space="preserve">  Processes:                         Data stores:</w:t>
-      </w:r>
-      <w:br/>
-      <w:r>
-        <w:rPr>
-          <w:rFonts w:ascii="Consolas" w:hAnsi="Consolas"/>
-          <w:sz w:val="16"/>
-        </w:rPr>
-        <w:t xml:space="preserve">   1.0  Authentication                D1  users</w:t>
-      </w:r>
-      <w:br/>
-      <w:r>
-        <w:rPr>
-          <w:rFonts w:ascii="Consolas" w:hAnsi="Consolas"/>
-          <w:sz w:val="16"/>
-        </w:rPr>
-        <w:t xml:space="preserve">   2.0  Product Catalog &amp; Search      D2  products / categories</w:t>
-      </w:r>
-      <w:br/>
-      <w:r>
-        <w:rPr>
-          <w:rFonts w:ascii="Consolas" w:hAnsi="Consolas"/>
-          <w:sz w:val="16"/>
-        </w:rPr>
-        <w:t xml:space="preserve">   3.0  Cart &amp; Wishlist               D3  cart / wishlist</w:t>
-      </w:r>
-      <w:br/>
-      <w:r>
-        <w:rPr>
-          <w:rFonts w:ascii="Consolas" w:hAnsi="Consolas"/>
-          <w:sz w:val="16"/>
-        </w:rPr>
-        <w:t xml:space="preserve">   4.0  Checkout &amp; Orders             D4  orders / order_items</w:t>
-      </w:r>
-      <w:br/>
-      <w:r>
-        <w:rPr>
-          <w:rFonts w:ascii="Consolas" w:hAnsi="Consolas"/>
-          <w:sz w:val="16"/>
-        </w:rPr>
-        <w:t xml:space="preserve">   5.0  Reviews                       D5  reviews</w:t>
-      </w:r>
-      <w:br/>
-      <w:r>
-        <w:rPr>
-          <w:rFonts w:ascii="Consolas" w:hAnsi="Consolas"/>
-          <w:sz w:val="16"/>
-        </w:rPr>
-        <w:t xml:space="preserve">   6.0  Admin Management              D6  promo_codes / contact_messages</w:t>
-      </w:r>
-      <w:br/>
-      <w:r>
-        <w:rPr>
-          <w:rFonts w:ascii="Consolas" w:hAnsi="Consolas"/>
-          <w:sz w:val="16"/>
-        </w:rPr>
-        <w:t xml:space="preserve"/>
-      </w:r>
-      <w:br/>
-      <w:r>
-        <w:rPr>
-          <w:rFonts w:ascii="Consolas" w:hAnsi="Consolas"/>
-          <w:sz w:val="16"/>
-        </w:rPr>
-        <w:t xml:space="preserve">  Customer -&gt; 1.0 -&gt; D1        Customer -&gt; 3.0 -&gt; D3</w:t>
-      </w:r>
-      <w:br/>
-      <w:r>
-        <w:rPr>
-          <w:rFonts w:ascii="Consolas" w:hAnsi="Consolas"/>
-          <w:sz w:val="16"/>
-        </w:rPr>
-        <w:t xml:space="preserve">  Customer -&gt; 2.0 -&gt; D2        Customer -&gt; 4.0 -&gt; D4 (reads D2, D3)</w:t>
-      </w:r>
-      <w:br/>
-      <w:r>
-        <w:rPr>
-          <w:rFonts w:ascii="Consolas" w:hAnsi="Consolas"/>
-          <w:sz w:val="16"/>
-        </w:rPr>
-        <w:t xml:space="preserve">  Customer -&gt; 5.0 -&gt; D5        Admin    -&gt; 6.0 -&gt; D2,D4,D1,D6</w:t>
-      </w:r>
-    </w:p>
-    <w:p>
-      <w:pPr>
-        <w:spacing w:before="40" w:after="80"/>
-      </w:pPr>
-      <w:r>
-        <w:rPr>
-          <w:sz w:val="21"/>
-          <w:szCs w:val="21"/>
-        </w:rPr>
-        <w:t xml:space="preserve">Note: these diagrams are presented in text form for the report; they can also be redrawn as labelled figures using draw.io or Lucidchart and inserted here.</w:t>
+        <w:t xml:space="preserve">6.3 Data Flow Diagram (Level 1)</w:t>
+      </w:r>
+    </w:p>
+    <w:p>
+      <w:pPr>
+        <w:jc w:val="center"/>
+        <w:spacing w:before="120" w:after="60"/>
+      </w:pPr>
+      <w:r>
+        <w:drawing>
+          <wp:inline distT="0" distB="0" distL="0" distR="0">
+            <wp:extent cx="5334000" cy="1066800"/>
+            <wp:effectExtent l="0" t="0" r="0" b="0"/>
+            <wp:docPr id="5" name="Picture 5"/>
+            <wp:cNvGraphicFramePr>
+              <a:graphicFrameLocks xmlns:a="http://schemas.openxmlformats.org/drawingml/2006/main" noChangeAspect="1"/>
+            </wp:cNvGraphicFramePr>
+            <a:graphic xmlns:a="http://schemas.openxmlformats.org/drawingml/2006/main">
+              <a:graphicData uri="http://schemas.openxmlformats.org/drawingml/2006/picture">
+                <pic:pic xmlns:pic="http://schemas.openxmlformats.org/drawingml/2006/picture">
+                  <pic:nvPicPr>
+                    <pic:cNvPr id="5" name="image5.png"/>
+                    <pic:cNvPicPr/>
+                  </pic:nvPicPr>
+                  <pic:blipFill>
+                    <a:blip r:embed="rIdImg5"/>
+                    <a:stretch>
+                      <a:fillRect/>
+                    </a:stretch>
+                  </pic:blipFill>
+                  <pic:spPr>
+                    <a:xfrm>
+                      <a:off x="0" y="0"/>
+                      <a:ext cx="5334000" cy="1066800"/>
+                    </a:xfrm>
+                    <a:prstGeom prst="rect">
+                      <a:avLst/>
+                    </a:prstGeom>
+                  </pic:spPr>
+                </pic:pic>
+              </a:graphicData>
+            </a:graphic>
+          </wp:inline>
+        </w:drawing>
+      </w:r>
+    </w:p>
+    <w:p>
+      <w:pPr>
+        <w:spacing w:before="40" w:after="160"/>
+        <w:jc w:val="center"/>
+      </w:pPr>
+      <w:r>
+        <w:rPr>
+          <w:i/>
+          <w:sz w:val="18"/>
+          <w:szCs w:val="18"/>
+          <w:color w:val="666666"/>
+        </w:rPr>
+        <w:t xml:space="preserve">Figure 6.3 - Level 1 data flow diagram</w:t>
       </w:r>
     </w:p>
     <w:p>
@@ -3712,7 +3341,7 @@
           <w:sz w:val="21"/>
           <w:szCs w:val="21"/>
         </w:rPr>
-        <w:t xml:space="preserve">Capture each screenshot from the running site and insert it below the matching heading. Suggested filenames are given.</w:t>
+        <w:t xml:space="preserve">Screenshots of the running system are inserted below each heading.</w:t>
       </w:r>
     </w:p>
     <w:p>
@@ -3739,7 +3368,21 @@
           <w:sz w:val="21"/>
           <w:szCs w:val="21"/>
         </w:rPr>
-        <w:t xml:space="preserve">Hero banner, category grid and featured products. [screenshot: 01-home.png]</w:t>
+        <w:t xml:space="preserve">Hero banner, category grid and featured products.</w:t>
+      </w:r>
+    </w:p>
+    <w:p>
+      <w:pPr>
+        <w:spacing w:before="40" w:after="80"/>
+      </w:pPr>
+      <w:r>
+        <w:rPr>
+          <w:i/>
+          <w:sz w:val="18"/>
+          <w:szCs w:val="18"/>
+          <w:color w:val="999999"/>
+        </w:rPr>
+        <w:t xml:space="preserve">[ Screenshot to be inserted ]</w:t>
       </w:r>
     </w:p>
     <w:p>
@@ -3766,7 +3409,21 @@
           <w:sz w:val="21"/>
           <w:szCs w:val="21"/>
         </w:rPr>
-        <w:t xml:space="preserve">Search, category/brand/price filters, sort dropdown and pagination. [screenshot: 02-products.png]</w:t>
+        <w:t xml:space="preserve">Search, category/brand/price filters, sort dropdown and pagination.</w:t>
+      </w:r>
+    </w:p>
+    <w:p>
+      <w:pPr>
+        <w:spacing w:before="40" w:after="80"/>
+      </w:pPr>
+      <w:r>
+        <w:rPr>
+          <w:i/>
+          <w:sz w:val="18"/>
+          <w:szCs w:val="18"/>
+          <w:color w:val="999999"/>
+        </w:rPr>
+        <w:t xml:space="preserve">[ Screenshot to be inserted ]</w:t>
       </w:r>
     </w:p>
     <w:p>
@@ -3793,7 +3450,21 @@
           <w:sz w:val="21"/>
           <w:szCs w:val="21"/>
         </w:rPr>
-        <w:t xml:space="preserve">Image, stock, description/review tabs, verified-purchase reviews, wishlist button. [screenshot: 03-product-details.png]</w:t>
+        <w:t xml:space="preserve">Image, stock, tabs, verified-purchase reviews and wishlist button.</w:t>
+      </w:r>
+    </w:p>
+    <w:p>
+      <w:pPr>
+        <w:spacing w:before="40" w:after="80"/>
+      </w:pPr>
+      <w:r>
+        <w:rPr>
+          <w:i/>
+          <w:sz w:val="18"/>
+          <w:szCs w:val="18"/>
+          <w:color w:val="999999"/>
+        </w:rPr>
+        <w:t xml:space="preserve">[ Screenshot to be inserted ]</w:t>
       </w:r>
     </w:p>
     <w:p>
@@ -3820,7 +3491,21 @@
           <w:sz w:val="21"/>
           <w:szCs w:val="21"/>
         </w:rPr>
-        <w:t xml:space="preserve">Client- and server-side validation with feedback. [screenshots: 04-register.png, 05-login.png]</w:t>
+        <w:t xml:space="preserve">Client- and server-side validation with feedback.</w:t>
+      </w:r>
+    </w:p>
+    <w:p>
+      <w:pPr>
+        <w:spacing w:before="40" w:after="80"/>
+      </w:pPr>
+      <w:r>
+        <w:rPr>
+          <w:i/>
+          <w:sz w:val="18"/>
+          <w:szCs w:val="18"/>
+          <w:color w:val="999999"/>
+        </w:rPr>
+        <w:t xml:space="preserve">[ Screenshot to be inserted ]</w:t>
       </w:r>
     </w:p>
     <w:p>
@@ -3847,7 +3532,21 @@
           <w:sz w:val="21"/>
           <w:szCs w:val="21"/>
         </w:rPr>
-        <w:t xml:space="preserve">Saved products with heart toggle. [screenshot: 06-wishlist.png]</w:t>
+        <w:t xml:space="preserve">Saved products with heart toggle.</w:t>
+      </w:r>
+    </w:p>
+    <w:p>
+      <w:pPr>
+        <w:spacing w:before="40" w:after="80"/>
+      </w:pPr>
+      <w:r>
+        <w:rPr>
+          <w:i/>
+          <w:sz w:val="18"/>
+          <w:szCs w:val="18"/>
+          <w:color w:val="999999"/>
+        </w:rPr>
+        <w:t xml:space="preserve">[ Screenshot to be inserted ]</w:t>
       </w:r>
     </w:p>
     <w:p>
@@ -3874,7 +3573,21 @@
           <w:sz w:val="21"/>
           <w:szCs w:val="21"/>
         </w:rPr>
-        <w:t xml:space="preserve">Editable quantities, remove, live totals. [screenshot: 07-cart.png]</w:t>
+        <w:t xml:space="preserve">Editable quantities, remove, live totals.</w:t>
+      </w:r>
+    </w:p>
+    <w:p>
+      <w:pPr>
+        <w:spacing w:before="40" w:after="80"/>
+      </w:pPr>
+      <w:r>
+        <w:rPr>
+          <w:i/>
+          <w:sz w:val="18"/>
+          <w:szCs w:val="18"/>
+          <w:color w:val="999999"/>
+        </w:rPr>
+        <w:t xml:space="preserve">[ Screenshot to be inserted ]</w:t>
       </w:r>
     </w:p>
     <w:p>
@@ -3901,7 +3614,21 @@
           <w:sz w:val="21"/>
           <w:szCs w:val="21"/>
         </w:rPr>
-        <w:t xml:space="preserve">Multi-step checkout with a working promo code (e.g. SPORT10). [screenshot: 08-checkout.png]</w:t>
+        <w:t xml:space="preserve">Multi-step checkout with a working promo code (e.g. SPORT10).</w:t>
+      </w:r>
+    </w:p>
+    <w:p>
+      <w:pPr>
+        <w:spacing w:before="40" w:after="80"/>
+      </w:pPr>
+      <w:r>
+        <w:rPr>
+          <w:i/>
+          <w:sz w:val="18"/>
+          <w:szCs w:val="18"/>
+          <w:color w:val="999999"/>
+        </w:rPr>
+        <w:t xml:space="preserve">[ Screenshot to be inserted ]</w:t>
       </w:r>
     </w:p>
     <w:p>
@@ -3928,7 +3655,21 @@
           <w:sz w:val="21"/>
           <w:szCs w:val="21"/>
         </w:rPr>
-        <w:t xml:space="preserve">Success page and order history with cancel option. [screenshots: 09-order-success.png, 10-orders.png]</w:t>
+        <w:t xml:space="preserve">Success page and order history with cancel option.</w:t>
+      </w:r>
+    </w:p>
+    <w:p>
+      <w:pPr>
+        <w:spacing w:before="40" w:after="80"/>
+      </w:pPr>
+      <w:r>
+        <w:rPr>
+          <w:i/>
+          <w:sz w:val="18"/>
+          <w:szCs w:val="18"/>
+          <w:color w:val="999999"/>
+        </w:rPr>
+        <w:t xml:space="preserve">[ Screenshot to be inserted ]</w:t>
       </w:r>
     </w:p>
     <w:p>
@@ -3955,7 +3696,21 @@
           <w:sz w:val="21"/>
           <w:szCs w:val="21"/>
         </w:rPr>
-        <w:t xml:space="preserve">Statistics cards, sales chart, recent orders, low-stock alerts. [screenshot: 11-admin-dashboard.png]</w:t>
+        <w:t xml:space="preserve">Statistics cards, sales chart, recent orders, low-stock alerts.</w:t>
+      </w:r>
+    </w:p>
+    <w:p>
+      <w:pPr>
+        <w:spacing w:before="40" w:after="80"/>
+      </w:pPr>
+      <w:r>
+        <w:rPr>
+          <w:i/>
+          <w:sz w:val="18"/>
+          <w:szCs w:val="18"/>
+          <w:color w:val="999999"/>
+        </w:rPr>
+        <w:t xml:space="preserve">[ Screenshot to be inserted ]</w:t>
       </w:r>
     </w:p>
     <w:p>
@@ -3982,7 +3737,21 @@
           <w:sz w:val="21"/>
           <w:szCs w:val="21"/>
         </w:rPr>
-        <w:t xml:space="preserve">Product management and order status updates. [screenshots: 12-admin-products.png, 13-admin-orders.png]</w:t>
+        <w:t xml:space="preserve">Product management and order status updates.</w:t>
+      </w:r>
+    </w:p>
+    <w:p>
+      <w:pPr>
+        <w:spacing w:before="40" w:after="80"/>
+      </w:pPr>
+      <w:r>
+        <w:rPr>
+          <w:i/>
+          <w:sz w:val="18"/>
+          <w:szCs w:val="18"/>
+          <w:color w:val="999999"/>
+        </w:rPr>
+        <w:t xml:space="preserve">[ Screenshot to be inserted ]</w:t>
       </w:r>
     </w:p>
     <w:p>
@@ -4009,7 +3778,21 @@
           <w:sz w:val="21"/>
           <w:szCs w:val="21"/>
         </w:rPr>
-        <w:t xml:space="preserve">About page and Contact form (saved to the database). [screenshot: 14-contact.png]</w:t>
+        <w:t xml:space="preserve">About page and Contact form (saved to the database).</w:t>
+      </w:r>
+    </w:p>
+    <w:p>
+      <w:pPr>
+        <w:spacing w:before="40" w:after="80"/>
+      </w:pPr>
+      <w:r>
+        <w:rPr>
+          <w:i/>
+          <w:sz w:val="18"/>
+          <w:szCs w:val="18"/>
+          <w:color w:val="999999"/>
+        </w:rPr>
+        <w:t xml:space="preserve">[ Screenshot to be inserted ]</w:t>
       </w:r>
     </w:p>
     <w:p>
@@ -4036,7 +3819,21 @@
           <w:sz w:val="21"/>
           <w:szCs w:val="21"/>
         </w:rPr>
-        <w:t xml:space="preserve">Mobile view (hamburger nav, stacked layout, filter drawer). [screenshot: 15-responsive.png]</w:t>
+        <w:t xml:space="preserve">Mobile view (hamburger nav, stacked layout, filter drawer).</w:t>
+      </w:r>
+    </w:p>
+    <w:p>
+      <w:pPr>
+        <w:spacing w:before="40" w:after="80"/>
+      </w:pPr>
+      <w:r>
+        <w:rPr>
+          <w:i/>
+          <w:sz w:val="18"/>
+          <w:szCs w:val="18"/>
+          <w:color w:val="999999"/>
+        </w:rPr>
+        <w:t xml:space="preserve">[ Screenshot to be inserted ]</w:t>
       </w:r>
     </w:p>
     <w:p>
@@ -4136,7 +3933,7 @@
               <w:rPr>
                 <w:sz w:val="18"/>
               </w:rPr>
-              <w:t xml:space="preserve">All queries use mysqli prepared statements with bound parameters; only whitelisted sort keys are ever placed in SQL.</w:t>
+              <w:t xml:space="preserve">All queries use mysqli prepared statements with bound parameters; only whitelisted sort keys are placed in SQL.</w:t>
             </w:r>
           </w:p>
         </w:tc>
@@ -4164,7 +3961,7 @@
               <w:rPr>
                 <w:sz w:val="18"/>
               </w:rPr>
-              <w:t xml:space="preserve">All dynamic output is escaped with htmlspecialchars (sanitize()). JSON in data- attributes is HTML-encoded then parsed.</w:t>
+              <w:t xml:space="preserve">All dynamic output is escaped with htmlspecialchars (sanitize()); JSON in data- attributes is HTML-encoded then parsed.</w:t>
             </w:r>
           </w:p>
         </w:tc>
@@ -4220,7 +4017,7 @@
               <w:rPr>
                 <w:sz w:val="18"/>
               </w:rPr>
-              <w:t xml:space="preserve">Every state-changing form carries a per-session token validated server-side with hash_equals().</w:t>
+              <w:t xml:space="preserve">Every state-changing form carries a per-session token validated with hash_equals().</w:t>
             </w:r>
           </w:p>
         </w:tc>
@@ -4276,7 +4073,7 @@
               <w:rPr>
                 <w:sz w:val="18"/>
               </w:rPr>
-              <w:t xml:space="preserve">require_login() / require_admin() protect pages; admin status is re-checked on every admin request.</w:t>
+              <w:t xml:space="preserve">require_login() / require_admin() protect pages; admin status re-checked each request.</w:t>
             </w:r>
           </w:p>
         </w:tc>
@@ -4557,7 +4354,7 @@
               <w:rPr>
                 <w:sz w:val="18"/>
               </w:rPr>
-              <w:t xml:space="preserve">"Email already exists" error</w:t>
+              <w:t xml:space="preserve">Email already exists error</w:t>
             </w:r>
           </w:p>
         </w:tc>
@@ -4611,7 +4408,7 @@
               <w:rPr>
                 <w:sz w:val="18"/>
               </w:rPr>
-              <w:t xml:space="preserve">"Invalid email or password"</w:t>
+              <w:t xml:space="preserve">Invalid email or password</w:t>
             </w:r>
           </w:p>
         </w:tc>
@@ -4989,7 +4786,7 @@
               <w:rPr>
                 <w:sz w:val="18"/>
               </w:rPr>
-              <w:t xml:space="preserve">Status becomes Cancelled, stock restored</w:t>
+              <w:t xml:space="preserve">Status Cancelled, stock restored</w:t>
             </w:r>
           </w:p>
         </w:tc>
@@ -5192,7 +4989,7 @@
               <w:rPr>
                 <w:sz w:val="18"/>
               </w:rPr>
-              <w:t xml:space="preserve">SQL injection in search ( ' OR 1=1 -- )</w:t>
+              <w:t xml:space="preserve">SQL injection in search</w:t>
             </w:r>
           </w:p>
         </w:tc>
@@ -5246,7 +5043,7 @@
               <w:rPr>
                 <w:sz w:val="18"/>
               </w:rPr>
-              <w:t xml:space="preserve">XSS in review ( &lt;script&gt; )</w:t>
+              <w:t xml:space="preserve">XSS in review field</w:t>
             </w:r>
           </w:p>
         </w:tc>
@@ -5478,7 +5275,7 @@
           <w:sz w:val="21"/>
           <w:szCs w:val="21"/>
         </w:rPr>
-        <w:t xml:space="preserve">Use the category menu, search bar or Shop page. Apply filters, sort and pagination to find products, then open a product for details and reviews.</w:t>
+        <w:t xml:space="preserve">Use the category menu, search bar or Shop page. Apply filters, sort and pagination, then open a product for details and reviews.</w:t>
       </w:r>
     </w:p>
     <w:p>
@@ -5513,7 +5310,7 @@
           <w:sz w:val="21"/>
           <w:szCs w:val="21"/>
         </w:rPr>
-        <w:t xml:space="preserve">Click the heart on any product (or "Add to Wishlist" on the product page) to save it; view saved items from the heart icon in the top bar.</w:t>
+        <w:t xml:space="preserve">Click the heart on a product (or Add to Wishlist on the product page) to save it; view saved items from the heart icon in the top bar.</w:t>
       </w:r>
     </w:p>
     <w:p>
@@ -5583,7 +5380,7 @@
           <w:sz w:val="21"/>
           <w:szCs w:val="21"/>
         </w:rPr>
-        <w:t xml:space="preserve">Track status under My Orders, view full details, or cancel an order while it is still Pending.</w:t>
+        <w:t xml:space="preserve">Track status under My Orders, view details, or cancel an order while it is still Pending.</w:t>
       </w:r>
     </w:p>
     <w:p>
@@ -5618,7 +5415,7 @@
           <w:sz w:val="21"/>
           <w:szCs w:val="21"/>
         </w:rPr>
-        <w:t xml:space="preserve">Log in as admin to reach the dashboard. Manage products (add/edit/delete with image upload), categories, orders (update status), users, and view contact messages.</w:t>
+        <w:t xml:space="preserve">Log in as admin to reach the dashboard, then manage products, categories, orders, users and contact messages.</w:t>
       </w:r>
     </w:p>
     <w:p>
@@ -6000,7 +5797,7 @@
           <w:sz w:val="21"/>
           <w:szCs w:val="21"/>
         </w:rPr>
-        <w:t xml:space="preserve">SportZone delivers a complete, secure and responsive B2C e-commerce platform that meets all core requirements: product management, role-based authentication, shopping cart, wishlist, promo codes, order processing and an administrative back office. It demonstrates clean separation of concerns through reusable PHP includes, a normalised MySQL schema, and defensive security practices (prepared statements, output escaping, password hashing and CSRF protection).</w:t>
+        <w:t xml:space="preserve">SportZone delivers a complete, secure and responsive B2C e-commerce platform that meets all core requirements: product management, role-based authentication, shopping cart, wishlist, promo codes, order processing and an administrative back office. It demonstrates clean separation of concerns through reusable PHP includes, a normalised MySQL schema, and defensive security practices.</w:t>
       </w:r>
     </w:p>
     <w:p>
@@ -6287,7 +6084,7 @@
           <w:sz w:val="21"/>
           <w:szCs w:val="21"/>
         </w:rPr>
-        <w:t xml:space="preserve">Content from external sources was paraphrased and adapted for this report.</w:t>
+        <w:t xml:space="preserve">Product images are Creative Commons works sourced via Openverse; full per-image attribution is provided in docs/IMAGE_CREDITS.md. Diagrams were produced with Mermaid. Content from external sources was paraphrased and adapted for this report.</w:t>
       </w:r>
     </w:p>
     <w:sectPr>

</xml_diff>

<commit_message>
Curate to 20 products with real photos, remove hero 404, labelled screenshot placeholders in report, clean up build tooling
</commit_message>
<xml_diff>
--- a/docs/SportZone_Technical_Report.docx
+++ b/docs/SportZone_Technical_Report.docx
@@ -3341,7 +3341,7 @@
           <w:sz w:val="21"/>
           <w:szCs w:val="21"/>
         </w:rPr>
-        <w:t xml:space="preserve">Screenshots of the running system are inserted below each heading.</w:t>
+        <w:t xml:space="preserve">Each feature below has a labelled placeholder. Capture the screenshot from the running site (URL given) and paste it in place of the placeholder box.</w:t>
       </w:r>
     </w:p>
     <w:p>
@@ -3373,16 +3373,32 @@
     </w:p>
     <w:p>
       <w:pPr>
-        <w:spacing w:before="40" w:after="80"/>
+        <w:spacing w:before="80" w:after="20"/>
+        <w:jc w:val="center"/>
+      </w:pPr>
+      <w:r>
+        <w:rPr>
+          <w:b/>
+          <w:sz w:val="22"/>
+          <w:szCs w:val="22"/>
+          <w:color w:val="E63946"/>
+        </w:rPr>
+        <w:t xml:space="preserve">[ INSERT SCREENSHOT HERE ]</w:t>
+      </w:r>
+    </w:p>
+    <w:p>
+      <w:pPr>
+        <w:spacing w:before="40" w:after="200"/>
+        <w:jc w:val="center"/>
       </w:pPr>
       <w:r>
         <w:rPr>
           <w:i/>
           <w:sz w:val="18"/>
           <w:szCs w:val="18"/>
-          <w:color w:val="999999"/>
-        </w:rPr>
-        <w:t xml:space="preserve">[ Screenshot to be inserted ]</w:t>
+          <w:color w:val="666666"/>
+        </w:rPr>
+        <w:t xml:space="preserve">Page: http://localhost/SportZone/index.php</w:t>
       </w:r>
     </w:p>
     <w:p>
@@ -3409,21 +3425,37 @@
           <w:sz w:val="21"/>
           <w:szCs w:val="21"/>
         </w:rPr>
-        <w:t xml:space="preserve">Search, category/brand/price filters, sort dropdown and pagination.</w:t>
-      </w:r>
-    </w:p>
-    <w:p>
-      <w:pPr>
-        <w:spacing w:before="40" w:after="80"/>
+        <w:t xml:space="preserve">Search, category / brand / price filters, sort dropdown and pagination.</w:t>
+      </w:r>
+    </w:p>
+    <w:p>
+      <w:pPr>
+        <w:spacing w:before="80" w:after="20"/>
+        <w:jc w:val="center"/>
+      </w:pPr>
+      <w:r>
+        <w:rPr>
+          <w:b/>
+          <w:sz w:val="22"/>
+          <w:szCs w:val="22"/>
+          <w:color w:val="E63946"/>
+        </w:rPr>
+        <w:t xml:space="preserve">[ INSERT SCREENSHOT HERE ]</w:t>
+      </w:r>
+    </w:p>
+    <w:p>
+      <w:pPr>
+        <w:spacing w:before="40" w:after="200"/>
+        <w:jc w:val="center"/>
       </w:pPr>
       <w:r>
         <w:rPr>
           <w:i/>
           <w:sz w:val="18"/>
           <w:szCs w:val="18"/>
-          <w:color w:val="999999"/>
-        </w:rPr>
-        <w:t xml:space="preserve">[ Screenshot to be inserted ]</w:t>
+          <w:color w:val="666666"/>
+        </w:rPr>
+        <w:t xml:space="preserve">Page: http://localhost/SportZone/products.php</w:t>
       </w:r>
     </w:p>
     <w:p>
@@ -3450,21 +3482,37 @@
           <w:sz w:val="21"/>
           <w:szCs w:val="21"/>
         </w:rPr>
-        <w:t xml:space="preserve">Image, stock, tabs, verified-purchase reviews and wishlist button.</w:t>
-      </w:r>
-    </w:p>
-    <w:p>
-      <w:pPr>
-        <w:spacing w:before="40" w:after="80"/>
+        <w:t xml:space="preserve">Product image, stock, description/review tabs, verified-purchase reviews and the wishlist button.</w:t>
+      </w:r>
+    </w:p>
+    <w:p>
+      <w:pPr>
+        <w:spacing w:before="80" w:after="20"/>
+        <w:jc w:val="center"/>
+      </w:pPr>
+      <w:r>
+        <w:rPr>
+          <w:b/>
+          <w:sz w:val="22"/>
+          <w:szCs w:val="22"/>
+          <w:color w:val="E63946"/>
+        </w:rPr>
+        <w:t xml:space="preserve">[ INSERT SCREENSHOT HERE ]</w:t>
+      </w:r>
+    </w:p>
+    <w:p>
+      <w:pPr>
+        <w:spacing w:before="40" w:after="200"/>
+        <w:jc w:val="center"/>
       </w:pPr>
       <w:r>
         <w:rPr>
           <w:i/>
           <w:sz w:val="18"/>
           <w:szCs w:val="18"/>
-          <w:color w:val="999999"/>
-        </w:rPr>
-        <w:t xml:space="preserve">[ Screenshot to be inserted ]</w:t>
+          <w:color w:val="666666"/>
+        </w:rPr>
+        <w:t xml:space="preserve">Page: http://localhost/SportZone/product-details.php?id=1</w:t>
       </w:r>
     </w:p>
     <w:p>
@@ -3479,7 +3527,7 @@
           <w:szCs w:val="24"/>
           <w:color w:val="2B2D42"/>
         </w:rPr>
-        <w:t xml:space="preserve">7.4 Registration &amp; Login</w:t>
+        <w:t xml:space="preserve">7.4 Registration</w:t>
       </w:r>
     </w:p>
     <w:p>
@@ -3491,21 +3539,37 @@
           <w:sz w:val="21"/>
           <w:szCs w:val="21"/>
         </w:rPr>
-        <w:t xml:space="preserve">Client- and server-side validation with feedback.</w:t>
-      </w:r>
-    </w:p>
-    <w:p>
-      <w:pPr>
-        <w:spacing w:before="40" w:after="80"/>
+        <w:t xml:space="preserve">Sign-up form with live validation.</w:t>
+      </w:r>
+    </w:p>
+    <w:p>
+      <w:pPr>
+        <w:spacing w:before="80" w:after="20"/>
+        <w:jc w:val="center"/>
+      </w:pPr>
+      <w:r>
+        <w:rPr>
+          <w:b/>
+          <w:sz w:val="22"/>
+          <w:szCs w:val="22"/>
+          <w:color w:val="E63946"/>
+        </w:rPr>
+        <w:t xml:space="preserve">[ INSERT SCREENSHOT HERE ]</w:t>
+      </w:r>
+    </w:p>
+    <w:p>
+      <w:pPr>
+        <w:spacing w:before="40" w:after="200"/>
+        <w:jc w:val="center"/>
       </w:pPr>
       <w:r>
         <w:rPr>
           <w:i/>
           <w:sz w:val="18"/>
           <w:szCs w:val="18"/>
-          <w:color w:val="999999"/>
-        </w:rPr>
-        <w:t xml:space="preserve">[ Screenshot to be inserted ]</w:t>
+          <w:color w:val="666666"/>
+        </w:rPr>
+        <w:t xml:space="preserve">Page: http://localhost/SportZone/register.php</w:t>
       </w:r>
     </w:p>
     <w:p>
@@ -3520,7 +3584,7 @@
           <w:szCs w:val="24"/>
           <w:color w:val="2B2D42"/>
         </w:rPr>
-        <w:t xml:space="preserve">7.5 Wishlist</w:t>
+        <w:t xml:space="preserve">7.5 Login</w:t>
       </w:r>
     </w:p>
     <w:p>
@@ -3532,21 +3596,37 @@
           <w:sz w:val="21"/>
           <w:szCs w:val="21"/>
         </w:rPr>
-        <w:t xml:space="preserve">Saved products with heart toggle.</w:t>
-      </w:r>
-    </w:p>
-    <w:p>
-      <w:pPr>
-        <w:spacing w:before="40" w:after="80"/>
+        <w:t xml:space="preserve">Login form (use the validation hint).</w:t>
+      </w:r>
+    </w:p>
+    <w:p>
+      <w:pPr>
+        <w:spacing w:before="80" w:after="20"/>
+        <w:jc w:val="center"/>
+      </w:pPr>
+      <w:r>
+        <w:rPr>
+          <w:b/>
+          <w:sz w:val="22"/>
+          <w:szCs w:val="22"/>
+          <w:color w:val="E63946"/>
+        </w:rPr>
+        <w:t xml:space="preserve">[ INSERT SCREENSHOT HERE ]</w:t>
+      </w:r>
+    </w:p>
+    <w:p>
+      <w:pPr>
+        <w:spacing w:before="40" w:after="200"/>
+        <w:jc w:val="center"/>
       </w:pPr>
       <w:r>
         <w:rPr>
           <w:i/>
           <w:sz w:val="18"/>
           <w:szCs w:val="18"/>
-          <w:color w:val="999999"/>
-        </w:rPr>
-        <w:t xml:space="preserve">[ Screenshot to be inserted ]</w:t>
+          <w:color w:val="666666"/>
+        </w:rPr>
+        <w:t xml:space="preserve">Page: http://localhost/SportZone/login.php</w:t>
       </w:r>
     </w:p>
     <w:p>
@@ -3561,7 +3641,7 @@
           <w:szCs w:val="24"/>
           <w:color w:val="2B2D42"/>
         </w:rPr>
-        <w:t xml:space="preserve">7.6 Shopping Cart</w:t>
+        <w:t xml:space="preserve">7.6 Wishlist</w:t>
       </w:r>
     </w:p>
     <w:p>
@@ -3573,21 +3653,37 @@
           <w:sz w:val="21"/>
           <w:szCs w:val="21"/>
         </w:rPr>
-        <w:t xml:space="preserve">Editable quantities, remove, live totals.</w:t>
-      </w:r>
-    </w:p>
-    <w:p>
-      <w:pPr>
-        <w:spacing w:before="40" w:after="80"/>
+        <w:t xml:space="preserve">Saved products with the heart toggle (log in as the customer first).</w:t>
+      </w:r>
+    </w:p>
+    <w:p>
+      <w:pPr>
+        <w:spacing w:before="80" w:after="20"/>
+        <w:jc w:val="center"/>
+      </w:pPr>
+      <w:r>
+        <w:rPr>
+          <w:b/>
+          <w:sz w:val="22"/>
+          <w:szCs w:val="22"/>
+          <w:color w:val="E63946"/>
+        </w:rPr>
+        <w:t xml:space="preserve">[ INSERT SCREENSHOT HERE ]</w:t>
+      </w:r>
+    </w:p>
+    <w:p>
+      <w:pPr>
+        <w:spacing w:before="40" w:after="200"/>
+        <w:jc w:val="center"/>
       </w:pPr>
       <w:r>
         <w:rPr>
           <w:i/>
           <w:sz w:val="18"/>
           <w:szCs w:val="18"/>
-          <w:color w:val="999999"/>
-        </w:rPr>
-        <w:t xml:space="preserve">[ Screenshot to be inserted ]</w:t>
+          <w:color w:val="666666"/>
+        </w:rPr>
+        <w:t xml:space="preserve">Page: http://localhost/SportZone/wishlist.php</w:t>
       </w:r>
     </w:p>
     <w:p>
@@ -3602,7 +3698,7 @@
           <w:szCs w:val="24"/>
           <w:color w:val="2B2D42"/>
         </w:rPr>
-        <w:t xml:space="preserve">7.7 Checkout + Promo Code</w:t>
+        <w:t xml:space="preserve">7.7 Shopping Cart</w:t>
       </w:r>
     </w:p>
     <w:p>
@@ -3614,21 +3710,37 @@
           <w:sz w:val="21"/>
           <w:szCs w:val="21"/>
         </w:rPr>
-        <w:t xml:space="preserve">Multi-step checkout with a working promo code (e.g. SPORT10).</w:t>
-      </w:r>
-    </w:p>
-    <w:p>
-      <w:pPr>
-        <w:spacing w:before="40" w:after="80"/>
+        <w:t xml:space="preserve">Editable quantities, remove buttons and live order summary (add a few items first).</w:t>
+      </w:r>
+    </w:p>
+    <w:p>
+      <w:pPr>
+        <w:spacing w:before="80" w:after="20"/>
+        <w:jc w:val="center"/>
+      </w:pPr>
+      <w:r>
+        <w:rPr>
+          <w:b/>
+          <w:sz w:val="22"/>
+          <w:szCs w:val="22"/>
+          <w:color w:val="E63946"/>
+        </w:rPr>
+        <w:t xml:space="preserve">[ INSERT SCREENSHOT HERE ]</w:t>
+      </w:r>
+    </w:p>
+    <w:p>
+      <w:pPr>
+        <w:spacing w:before="40" w:after="200"/>
+        <w:jc w:val="center"/>
       </w:pPr>
       <w:r>
         <w:rPr>
           <w:i/>
           <w:sz w:val="18"/>
           <w:szCs w:val="18"/>
-          <w:color w:val="999999"/>
-        </w:rPr>
-        <w:t xml:space="preserve">[ Screenshot to be inserted ]</w:t>
+          <w:color w:val="666666"/>
+        </w:rPr>
+        <w:t xml:space="preserve">Page: http://localhost/SportZone/cart.php</w:t>
       </w:r>
     </w:p>
     <w:p>
@@ -3643,7 +3755,7 @@
           <w:szCs w:val="24"/>
           <w:color w:val="2B2D42"/>
         </w:rPr>
-        <w:t xml:space="preserve">7.8 Order Confirmation &amp; Tracking</w:t>
+        <w:t xml:space="preserve">7.8 Checkout + Promo Code</w:t>
       </w:r>
     </w:p>
     <w:p>
@@ -3655,21 +3767,37 @@
           <w:sz w:val="21"/>
           <w:szCs w:val="21"/>
         </w:rPr>
-        <w:t xml:space="preserve">Success page and order history with cancel option.</w:t>
-      </w:r>
-    </w:p>
-    <w:p>
-      <w:pPr>
-        <w:spacing w:before="40" w:after="80"/>
+        <w:t xml:space="preserve">Multi-step checkout; apply promo code SPORT10 to show the discount.</w:t>
+      </w:r>
+    </w:p>
+    <w:p>
+      <w:pPr>
+        <w:spacing w:before="80" w:after="20"/>
+        <w:jc w:val="center"/>
+      </w:pPr>
+      <w:r>
+        <w:rPr>
+          <w:b/>
+          <w:sz w:val="22"/>
+          <w:szCs w:val="22"/>
+          <w:color w:val="E63946"/>
+        </w:rPr>
+        <w:t xml:space="preserve">[ INSERT SCREENSHOT HERE ]</w:t>
+      </w:r>
+    </w:p>
+    <w:p>
+      <w:pPr>
+        <w:spacing w:before="40" w:after="200"/>
+        <w:jc w:val="center"/>
       </w:pPr>
       <w:r>
         <w:rPr>
           <w:i/>
           <w:sz w:val="18"/>
           <w:szCs w:val="18"/>
-          <w:color w:val="999999"/>
-        </w:rPr>
-        <w:t xml:space="preserve">[ Screenshot to be inserted ]</w:t>
+          <w:color w:val="666666"/>
+        </w:rPr>
+        <w:t xml:space="preserve">Page: http://localhost/SportZone/checkout.php</w:t>
       </w:r>
     </w:p>
     <w:p>
@@ -3684,7 +3812,7 @@
           <w:szCs w:val="24"/>
           <w:color w:val="2B2D42"/>
         </w:rPr>
-        <w:t xml:space="preserve">7.9 Admin Dashboard</w:t>
+        <w:t xml:space="preserve">7.9 Order History &amp; Tracking</w:t>
       </w:r>
     </w:p>
     <w:p>
@@ -3696,21 +3824,37 @@
           <w:sz w:val="21"/>
           <w:szCs w:val="21"/>
         </w:rPr>
-        <w:t xml:space="preserve">Statistics cards, sales chart, recent orders, low-stock alerts.</w:t>
-      </w:r>
-    </w:p>
-    <w:p>
-      <w:pPr>
-        <w:spacing w:before="40" w:after="80"/>
+        <w:t xml:space="preserve">Order list with status badges, details modal and the cancel option.</w:t>
+      </w:r>
+    </w:p>
+    <w:p>
+      <w:pPr>
+        <w:spacing w:before="80" w:after="20"/>
+        <w:jc w:val="center"/>
+      </w:pPr>
+      <w:r>
+        <w:rPr>
+          <w:b/>
+          <w:sz w:val="22"/>
+          <w:szCs w:val="22"/>
+          <w:color w:val="E63946"/>
+        </w:rPr>
+        <w:t xml:space="preserve">[ INSERT SCREENSHOT HERE ]</w:t>
+      </w:r>
+    </w:p>
+    <w:p>
+      <w:pPr>
+        <w:spacing w:before="40" w:after="200"/>
+        <w:jc w:val="center"/>
       </w:pPr>
       <w:r>
         <w:rPr>
           <w:i/>
           <w:sz w:val="18"/>
           <w:szCs w:val="18"/>
-          <w:color w:val="999999"/>
-        </w:rPr>
-        <w:t xml:space="preserve">[ Screenshot to be inserted ]</w:t>
+          <w:color w:val="666666"/>
+        </w:rPr>
+        <w:t xml:space="preserve">Page: http://localhost/SportZone/orders.php</w:t>
       </w:r>
     </w:p>
     <w:p>
@@ -3725,7 +3869,7 @@
           <w:szCs w:val="24"/>
           <w:color w:val="2B2D42"/>
         </w:rPr>
-        <w:t xml:space="preserve">7.10 Admin Product CRUD &amp; Orders</w:t>
+        <w:t xml:space="preserve">7.10 Admin Dashboard</w:t>
       </w:r>
     </w:p>
     <w:p>
@@ -3737,21 +3881,37 @@
           <w:sz w:val="21"/>
           <w:szCs w:val="21"/>
         </w:rPr>
-        <w:t xml:space="preserve">Product management and order status updates.</w:t>
-      </w:r>
-    </w:p>
-    <w:p>
-      <w:pPr>
-        <w:spacing w:before="40" w:after="80"/>
+        <w:t xml:space="preserve">Statistics cards, the sales chart, recent orders and low-stock alerts (log in as admin).</w:t>
+      </w:r>
+    </w:p>
+    <w:p>
+      <w:pPr>
+        <w:spacing w:before="80" w:after="20"/>
+        <w:jc w:val="center"/>
+      </w:pPr>
+      <w:r>
+        <w:rPr>
+          <w:b/>
+          <w:sz w:val="22"/>
+          <w:szCs w:val="22"/>
+          <w:color w:val="E63946"/>
+        </w:rPr>
+        <w:t xml:space="preserve">[ INSERT SCREENSHOT HERE ]</w:t>
+      </w:r>
+    </w:p>
+    <w:p>
+      <w:pPr>
+        <w:spacing w:before="40" w:after="200"/>
+        <w:jc w:val="center"/>
       </w:pPr>
       <w:r>
         <w:rPr>
           <w:i/>
           <w:sz w:val="18"/>
           <w:szCs w:val="18"/>
-          <w:color w:val="999999"/>
-        </w:rPr>
-        <w:t xml:space="preserve">[ Screenshot to be inserted ]</w:t>
+          <w:color w:val="666666"/>
+        </w:rPr>
+        <w:t xml:space="preserve">Page: http://localhost/SportZone/admin/dashboard.php</w:t>
       </w:r>
     </w:p>
     <w:p>
@@ -3766,7 +3926,7 @@
           <w:szCs w:val="24"/>
           <w:color w:val="2B2D42"/>
         </w:rPr>
-        <w:t xml:space="preserve">7.11 About &amp; Contact</w:t>
+        <w:t xml:space="preserve">7.11 Admin Product Management</w:t>
       </w:r>
     </w:p>
     <w:p>
@@ -3778,21 +3938,37 @@
           <w:sz w:val="21"/>
           <w:szCs w:val="21"/>
         </w:rPr>
-        <w:t xml:space="preserve">About page and Contact form (saved to the database).</w:t>
-      </w:r>
-    </w:p>
-    <w:p>
-      <w:pPr>
-        <w:spacing w:before="40" w:after="80"/>
+        <w:t xml:space="preserve">Product list with edit/delete and the add/edit form with image upload.</w:t>
+      </w:r>
+    </w:p>
+    <w:p>
+      <w:pPr>
+        <w:spacing w:before="80" w:after="20"/>
+        <w:jc w:val="center"/>
+      </w:pPr>
+      <w:r>
+        <w:rPr>
+          <w:b/>
+          <w:sz w:val="22"/>
+          <w:szCs w:val="22"/>
+          <w:color w:val="E63946"/>
+        </w:rPr>
+        <w:t xml:space="preserve">[ INSERT SCREENSHOT HERE ]</w:t>
+      </w:r>
+    </w:p>
+    <w:p>
+      <w:pPr>
+        <w:spacing w:before="40" w:after="200"/>
+        <w:jc w:val="center"/>
       </w:pPr>
       <w:r>
         <w:rPr>
           <w:i/>
           <w:sz w:val="18"/>
           <w:szCs w:val="18"/>
-          <w:color w:val="999999"/>
-        </w:rPr>
-        <w:t xml:space="preserve">[ Screenshot to be inserted ]</w:t>
+          <w:color w:val="666666"/>
+        </w:rPr>
+        <w:t xml:space="preserve">Page: http://localhost/SportZone/admin/products.php</w:t>
       </w:r>
     </w:p>
     <w:p>
@@ -3807,7 +3983,7 @@
           <w:szCs w:val="24"/>
           <w:color w:val="2B2D42"/>
         </w:rPr>
-        <w:t xml:space="preserve">7.12 Responsive Design</w:t>
+        <w:t xml:space="preserve">7.12 Admin Order Management</w:t>
       </w:r>
     </w:p>
     <w:p>
@@ -3819,21 +3995,151 @@
           <w:sz w:val="21"/>
           <w:szCs w:val="21"/>
         </w:rPr>
-        <w:t xml:space="preserve">Mobile view (hamburger nav, stacked layout, filter drawer).</w:t>
-      </w:r>
-    </w:p>
-    <w:p>
-      <w:pPr>
-        <w:spacing w:before="40" w:after="80"/>
+        <w:t xml:space="preserve">Orders list with the status dropdown and order details.</w:t>
+      </w:r>
+    </w:p>
+    <w:p>
+      <w:pPr>
+        <w:spacing w:before="80" w:after="20"/>
+        <w:jc w:val="center"/>
+      </w:pPr>
+      <w:r>
+        <w:rPr>
+          <w:b/>
+          <w:sz w:val="22"/>
+          <w:szCs w:val="22"/>
+          <w:color w:val="E63946"/>
+        </w:rPr>
+        <w:t xml:space="preserve">[ INSERT SCREENSHOT HERE ]</w:t>
+      </w:r>
+    </w:p>
+    <w:p>
+      <w:pPr>
+        <w:spacing w:before="40" w:after="200"/>
+        <w:jc w:val="center"/>
       </w:pPr>
       <w:r>
         <w:rPr>
           <w:i/>
           <w:sz w:val="18"/>
           <w:szCs w:val="18"/>
-          <w:color w:val="999999"/>
-        </w:rPr>
-        <w:t xml:space="preserve">[ Screenshot to be inserted ]</w:t>
+          <w:color w:val="666666"/>
+        </w:rPr>
+        <w:t xml:space="preserve">Page: http://localhost/SportZone/admin/orders.php</w:t>
+      </w:r>
+    </w:p>
+    <w:p>
+      <w:pPr>
+        <w:spacing w:before="160" w:after="80"/>
+        <w:outlineLvl w:val="2"/>
+      </w:pPr>
+      <w:r>
+        <w:rPr>
+          <w:b/>
+          <w:sz w:val="24"/>
+          <w:szCs w:val="24"/>
+          <w:color w:val="2B2D42"/>
+        </w:rPr>
+        <w:t xml:space="preserve">7.13 About &amp; Contact</w:t>
+      </w:r>
+    </w:p>
+    <w:p>
+      <w:pPr>
+        <w:spacing w:before="40" w:after="80"/>
+      </w:pPr>
+      <w:r>
+        <w:rPr>
+          <w:sz w:val="21"/>
+          <w:szCs w:val="21"/>
+        </w:rPr>
+        <w:t xml:space="preserve">About page and the Contact form (saved to the database).</w:t>
+      </w:r>
+    </w:p>
+    <w:p>
+      <w:pPr>
+        <w:spacing w:before="80" w:after="20"/>
+        <w:jc w:val="center"/>
+      </w:pPr>
+      <w:r>
+        <w:rPr>
+          <w:b/>
+          <w:sz w:val="22"/>
+          <w:szCs w:val="22"/>
+          <w:color w:val="E63946"/>
+        </w:rPr>
+        <w:t xml:space="preserve">[ INSERT SCREENSHOT HERE ]</w:t>
+      </w:r>
+    </w:p>
+    <w:p>
+      <w:pPr>
+        <w:spacing w:before="40" w:after="200"/>
+        <w:jc w:val="center"/>
+      </w:pPr>
+      <w:r>
+        <w:rPr>
+          <w:i/>
+          <w:sz w:val="18"/>
+          <w:szCs w:val="18"/>
+          <w:color w:val="666666"/>
+        </w:rPr>
+        <w:t xml:space="preserve">Page: http://localhost/SportZone/contact.php</w:t>
+      </w:r>
+    </w:p>
+    <w:p>
+      <w:pPr>
+        <w:spacing w:before="160" w:after="80"/>
+        <w:outlineLvl w:val="2"/>
+      </w:pPr>
+      <w:r>
+        <w:rPr>
+          <w:b/>
+          <w:sz w:val="24"/>
+          <w:szCs w:val="24"/>
+          <w:color w:val="2B2D42"/>
+        </w:rPr>
+        <w:t xml:space="preserve">7.14 Responsive (Mobile) View</w:t>
+      </w:r>
+    </w:p>
+    <w:p>
+      <w:pPr>
+        <w:spacing w:before="40" w:after="80"/>
+      </w:pPr>
+      <w:r>
+        <w:rPr>
+          <w:sz w:val="21"/>
+          <w:szCs w:val="21"/>
+        </w:rPr>
+        <w:t xml:space="preserve">Home or product page at a narrow width (hamburger menu, stacked layout).</w:t>
+      </w:r>
+    </w:p>
+    <w:p>
+      <w:pPr>
+        <w:spacing w:before="80" w:after="20"/>
+        <w:jc w:val="center"/>
+      </w:pPr>
+      <w:r>
+        <w:rPr>
+          <w:b/>
+          <w:sz w:val="22"/>
+          <w:szCs w:val="22"/>
+          <w:color w:val="E63946"/>
+        </w:rPr>
+        <w:t xml:space="preserve">[ INSERT SCREENSHOT HERE ]</w:t>
+      </w:r>
+    </w:p>
+    <w:p>
+      <w:pPr>
+        <w:spacing w:before="40" w:after="200"/>
+        <w:jc w:val="center"/>
+      </w:pPr>
+      <w:r>
+        <w:rPr>
+          <w:i/>
+          <w:sz w:val="18"/>
+          <w:szCs w:val="18"/>
+          <w:color w:val="666666"/>
+        </w:rPr>
+        <w:t xml:space="preserve">Page: http://localhost/SportZone/index.php  (resize browser to ~390px wide)</w:t>
       </w:r>
     </w:p>
     <w:p>

</xml_diff>

<commit_message>
Replace product images with Bria AI studio photos, add presentation guide, update report image source
</commit_message>
<xml_diff>
--- a/docs/SportZone_Technical_Report.docx
+++ b/docs/SportZone_Technical_Report.docx
@@ -6390,7 +6390,7 @@
           <w:sz w:val="21"/>
           <w:szCs w:val="21"/>
         </w:rPr>
-        <w:t xml:space="preserve">Product images are Creative Commons works sourced via Openverse; full per-image attribution is provided in docs/IMAGE_CREDITS.md. Diagrams were produced with Mermaid. Content from external sources was paraphrased and adapted for this report.</w:t>
+        <w:t>Product images were generated using the Bria AI image generation API (commercially licensed and royalty-free). Diagrams were produced with Mermaid. Content from external sources was paraphrased and adapted for this report.</w:t>
       </w:r>
     </w:p>
     <w:sectPr>
@@ -6399,4 +6399,190 @@
     </w:sectPr>
   </w:body>
 </w:document>
+</file>
+
+<file path=word/styles.xml><?xml version="1.0" encoding="utf-8"?>
+<w:styles xmlns:mc="http://schemas.openxmlformats.org/markup-compatibility/2006" xmlns:r="http://schemas.openxmlformats.org/officeDocument/2006/relationships" xmlns:w14="http://schemas.microsoft.com/office/word/2010/wordml" xmlns:w="http://schemas.openxmlformats.org/wordprocessingml/2006/main" mc:Ignorable="w14">
+  <w:docDefaults>
+    <w:rPrDefault>
+      <w:rPr>
+        <w:rFonts w:asciiTheme="minorHAnsi" w:eastAsiaTheme="minorEastAsia" w:hAnsiTheme="minorHAnsi" w:cstheme="minorBidi"/>
+        <w:sz w:val="24"/>
+        <w:szCs w:val="24"/>
+        <w:lang w:val="en-US" w:eastAsia="en-US" w:bidi="ar-SA"/>
+      </w:rPr>
+    </w:rPrDefault>
+    <w:pPrDefault/>
+  </w:docDefaults>
+  <w:latentStyles w:defLockedState="0" w:defUIPriority="99" w:defSemiHidden="1" w:defUnhideWhenUsed="1" w:defQFormat="0" w:count="276">
+    <w:lsdException w:name="Normal" w:semiHidden="0" w:uiPriority="0" w:unhideWhenUsed="0" w:qFormat="1"/>
+    <w:lsdException w:name="heading 1" w:semiHidden="0" w:uiPriority="9" w:unhideWhenUsed="0" w:qFormat="1"/>
+    <w:lsdException w:name="heading 2" w:uiPriority="9" w:qFormat="1"/>
+    <w:lsdException w:name="heading 3" w:uiPriority="9" w:qFormat="1"/>
+    <w:lsdException w:name="heading 4" w:uiPriority="9" w:qFormat="1"/>
+    <w:lsdException w:name="heading 5" w:uiPriority="9" w:qFormat="1"/>
+    <w:lsdException w:name="heading 6" w:uiPriority="9" w:qFormat="1"/>
+    <w:lsdException w:name="heading 7" w:uiPriority="9" w:qFormat="1"/>
+    <w:lsdException w:name="heading 8" w:uiPriority="9" w:qFormat="1"/>
+    <w:lsdException w:name="heading 9" w:uiPriority="9" w:qFormat="1"/>
+    <w:lsdException w:name="toc 1" w:uiPriority="39"/>
+    <w:lsdException w:name="toc 2" w:uiPriority="39"/>
+    <w:lsdException w:name="toc 3" w:uiPriority="39"/>
+    <w:lsdException w:name="toc 4" w:uiPriority="39"/>
+    <w:lsdException w:name="toc 5" w:uiPriority="39"/>
+    <w:lsdException w:name="toc 6" w:uiPriority="39"/>
+    <w:lsdException w:name="toc 7" w:uiPriority="39"/>
+    <w:lsdException w:name="toc 8" w:uiPriority="39"/>
+    <w:lsdException w:name="toc 9" w:uiPriority="39"/>
+    <w:lsdException w:name="caption" w:uiPriority="35" w:qFormat="1"/>
+    <w:lsdException w:name="Title" w:semiHidden="0" w:uiPriority="10" w:unhideWhenUsed="0" w:qFormat="1"/>
+    <w:lsdException w:name="Default Paragraph Font" w:uiPriority="1"/>
+    <w:lsdException w:name="Subtitle" w:semiHidden="0" w:uiPriority="11" w:unhideWhenUsed="0" w:qFormat="1"/>
+    <w:lsdException w:name="Strong" w:semiHidden="0" w:uiPriority="22" w:unhideWhenUsed="0" w:qFormat="1"/>
+    <w:lsdException w:name="Emphasis" w:semiHidden="0" w:uiPriority="20" w:unhideWhenUsed="0" w:qFormat="1"/>
+    <w:lsdException w:name="Table Grid" w:semiHidden="0" w:uiPriority="59" w:unhideWhenUsed="0"/>
+    <w:lsdException w:name="Placeholder Text" w:unhideWhenUsed="0"/>
+    <w:lsdException w:name="No Spacing" w:semiHidden="0" w:uiPriority="1" w:unhideWhenUsed="0" w:qFormat="1"/>
+    <w:lsdException w:name="Light Shading" w:semiHidden="0" w:uiPriority="60" w:unhideWhenUsed="0"/>
+    <w:lsdException w:name="Light List" w:semiHidden="0" w:uiPriority="61" w:unhideWhenUsed="0"/>
+    <w:lsdException w:name="Light Grid" w:semiHidden="0" w:uiPriority="62" w:unhideWhenUsed="0"/>
+    <w:lsdException w:name="Medium Shading 1" w:semiHidden="0" w:uiPriority="63" w:unhideWhenUsed="0"/>
+    <w:lsdException w:name="Medium Shading 2" w:semiHidden="0" w:uiPriority="64" w:unhideWhenUsed="0"/>
+    <w:lsdException w:name="Medium List 1" w:semiHidden="0" w:uiPriority="65" w:unhideWhenUsed="0"/>
+    <w:lsdException w:name="Medium List 2" w:semiHidden="0" w:uiPriority="66" w:unhideWhenUsed="0"/>
+    <w:lsdException w:name="Medium Grid 1" w:semiHidden="0" w:uiPriority="67" w:unhideWhenUsed="0"/>
+    <w:lsdException w:name="Medium Grid 2" w:semiHidden="0" w:uiPriority="68" w:unhideWhenUsed="0"/>
+    <w:lsdException w:name="Medium Grid 3" w:semiHidden="0" w:uiPriority="69" w:unhideWhenUsed="0"/>
+    <w:lsdException w:name="Dark List" w:semiHidden="0" w:uiPriority="70" w:unhideWhenUsed="0"/>
+    <w:lsdException w:name="Colorful Shading" w:semiHidden="0" w:uiPriority="71" w:unhideWhenUsed="0"/>
+    <w:lsdException w:name="Colorful List" w:semiHidden="0" w:uiPriority="72" w:unhideWhenUsed="0"/>
+    <w:lsdException w:name="Colorful Grid" w:semiHidden="0" w:uiPriority="73" w:unhideWhenUsed="0"/>
+    <w:lsdException w:name="Light Shading Accent 1" w:semiHidden="0" w:uiPriority="60" w:unhideWhenUsed="0"/>
+    <w:lsdException w:name="Light List Accent 1" w:semiHidden="0" w:uiPriority="61" w:unhideWhenUsed="0"/>
+    <w:lsdException w:name="Light Grid Accent 1" w:semiHidden="0" w:uiPriority="62" w:unhideWhenUsed="0"/>
+    <w:lsdException w:name="Medium Shading 1 Accent 1" w:semiHidden="0" w:uiPriority="63" w:unhideWhenUsed="0"/>
+    <w:lsdException w:name="Medium Shading 2 Accent 1" w:semiHidden="0" w:uiPriority="64" w:unhideWhenUsed="0"/>
+    <w:lsdException w:name="Medium List 1 Accent 1" w:semiHidden="0" w:uiPriority="65" w:unhideWhenUsed="0"/>
+    <w:lsdException w:name="Revision" w:unhideWhenUsed="0"/>
+    <w:lsdException w:name="List Paragraph" w:semiHidden="0" w:uiPriority="34" w:unhideWhenUsed="0" w:qFormat="1"/>
+    <w:lsdException w:name="Quote" w:semiHidden="0" w:uiPriority="29" w:unhideWhenUsed="0" w:qFormat="1"/>
+    <w:lsdException w:name="Intense Quote" w:semiHidden="0" w:uiPriority="30" w:unhideWhenUsed="0" w:qFormat="1"/>
+    <w:lsdException w:name="Medium List 2 Accent 1" w:semiHidden="0" w:uiPriority="66" w:unhideWhenUsed="0"/>
+    <w:lsdException w:name="Medium Grid 1 Accent 1" w:semiHidden="0" w:uiPriority="67" w:unhideWhenUsed="0"/>
+    <w:lsdException w:name="Medium Grid 2 Accent 1" w:semiHidden="0" w:uiPriority="68" w:unhideWhenUsed="0"/>
+    <w:lsdException w:name="Medium Grid 3 Accent 1" w:semiHidden="0" w:uiPriority="69" w:unhideWhenUsed="0"/>
+    <w:lsdException w:name="Dark List Accent 1" w:semiHidden="0" w:uiPriority="70" w:unhideWhenUsed="0"/>
+    <w:lsdException w:name="Colorful Shading Accent 1" w:semiHidden="0" w:uiPriority="71" w:unhideWhenUsed="0"/>
+    <w:lsdException w:name="Colorful List Accent 1" w:semiHidden="0" w:uiPriority="72" w:unhideWhenUsed="0"/>
+    <w:lsdException w:name="Colorful Grid Accent 1" w:semiHidden="0" w:uiPriority="73" w:unhideWhenUsed="0"/>
+    <w:lsdException w:name="Light Shading Accent 2" w:semiHidden="0" w:uiPriority="60" w:unhideWhenUsed="0"/>
+    <w:lsdException w:name="Light List Accent 2" w:semiHidden="0" w:uiPriority="61" w:unhideWhenUsed="0"/>
+    <w:lsdException w:name="Light Grid Accent 2" w:semiHidden="0" w:uiPriority="62" w:unhideWhenUsed="0"/>
+    <w:lsdException w:name="Medium Shading 1 Accent 2" w:semiHidden="0" w:uiPriority="63" w:unhideWhenUsed="0"/>
+    <w:lsdException w:name="Medium Shading 2 Accent 2" w:semiHidden="0" w:uiPriority="64" w:unhideWhenUsed="0"/>
+    <w:lsdException w:name="Medium List 1 Accent 2" w:semiHidden="0" w:uiPriority="65" w:unhideWhenUsed="0"/>
+    <w:lsdException w:name="Medium List 2 Accent 2" w:semiHidden="0" w:uiPriority="66" w:unhideWhenUsed="0"/>
+    <w:lsdException w:name="Medium Grid 1 Accent 2" w:semiHidden="0" w:uiPriority="67" w:unhideWhenUsed="0"/>
+    <w:lsdException w:name="Medium Grid 2 Accent 2" w:semiHidden="0" w:uiPriority="68" w:unhideWhenUsed="0"/>
+    <w:lsdException w:name="Medium Grid 3 Accent 2" w:semiHidden="0" w:uiPriority="69" w:unhideWhenUsed="0"/>
+    <w:lsdException w:name="Dark List Accent 2" w:semiHidden="0" w:uiPriority="70" w:unhideWhenUsed="0"/>
+    <w:lsdException w:name="Colorful Shading Accent 2" w:semiHidden="0" w:uiPriority="71" w:unhideWhenUsed="0"/>
+    <w:lsdException w:name="Colorful List Accent 2" w:semiHidden="0" w:uiPriority="72" w:unhideWhenUsed="0"/>
+    <w:lsdException w:name="Colorful Grid Accent 2" w:semiHidden="0" w:uiPriority="73" w:unhideWhenUsed="0"/>
+    <w:lsdException w:name="Light Shading Accent 3" w:semiHidden="0" w:uiPriority="60" w:unhideWhenUsed="0"/>
+    <w:lsdException w:name="Light List Accent 3" w:semiHidden="0" w:uiPriority="61" w:unhideWhenUsed="0"/>
+    <w:lsdException w:name="Light Grid Accent 3" w:semiHidden="0" w:uiPriority="62" w:unhideWhenUsed="0"/>
+    <w:lsdException w:name="Medium Shading 1 Accent 3" w:semiHidden="0" w:uiPriority="63" w:unhideWhenUsed="0"/>
+    <w:lsdException w:name="Medium Shading 2 Accent 3" w:semiHidden="0" w:uiPriority="64" w:unhideWhenUsed="0"/>
+    <w:lsdException w:name="Medium List 1 Accent 3" w:semiHidden="0" w:uiPriority="65" w:unhideWhenUsed="0"/>
+    <w:lsdException w:name="Medium List 2 Accent 3" w:semiHidden="0" w:uiPriority="66" w:unhideWhenUsed="0"/>
+    <w:lsdException w:name="Medium Grid 1 Accent 3" w:semiHidden="0" w:uiPriority="67" w:unhideWhenUsed="0"/>
+    <w:lsdException w:name="Medium Grid 2 Accent 3" w:semiHidden="0" w:uiPriority="68" w:unhideWhenUsed="0"/>
+    <w:lsdException w:name="Medium Grid 3 Accent 3" w:semiHidden="0" w:uiPriority="69" w:unhideWhenUsed="0"/>
+    <w:lsdException w:name="Dark List Accent 3" w:semiHidden="0" w:uiPriority="70" w:unhideWhenUsed="0"/>
+    <w:lsdException w:name="Colorful Shading Accent 3" w:semiHidden="0" w:uiPriority="71" w:unhideWhenUsed="0"/>
+    <w:lsdException w:name="Colorful List Accent 3" w:semiHidden="0" w:uiPriority="72" w:unhideWhenUsed="0"/>
+    <w:lsdException w:name="Colorful Grid Accent 3" w:semiHidden="0" w:uiPriority="73" w:unhideWhenUsed="0"/>
+    <w:lsdException w:name="Light Shading Accent 4" w:semiHidden="0" w:uiPriority="60" w:unhideWhenUsed="0"/>
+    <w:lsdException w:name="Light List Accent 4" w:semiHidden="0" w:uiPriority="61" w:unhideWhenUsed="0"/>
+    <w:lsdException w:name="Light Grid Accent 4" w:semiHidden="0" w:uiPriority="62" w:unhideWhenUsed="0"/>
+    <w:lsdException w:name="Medium Shading 1 Accent 4" w:semiHidden="0" w:uiPriority="63" w:unhideWhenUsed="0"/>
+    <w:lsdException w:name="Medium Shading 2 Accent 4" w:semiHidden="0" w:uiPriority="64" w:unhideWhenUsed="0"/>
+    <w:lsdException w:name="Medium List 1 Accent 4" w:semiHidden="0" w:uiPriority="65" w:unhideWhenUsed="0"/>
+    <w:lsdException w:name="Medium List 2 Accent 4" w:semiHidden="0" w:uiPriority="66" w:unhideWhenUsed="0"/>
+    <w:lsdException w:name="Medium Grid 1 Accent 4" w:semiHidden="0" w:uiPriority="67" w:unhideWhenUsed="0"/>
+    <w:lsdException w:name="Medium Grid 2 Accent 4" w:semiHidden="0" w:uiPriority="68" w:unhideWhenUsed="0"/>
+    <w:lsdException w:name="Medium Grid 3 Accent 4" w:semiHidden="0" w:uiPriority="69" w:unhideWhenUsed="0"/>
+    <w:lsdException w:name="Dark List Accent 4" w:semiHidden="0" w:uiPriority="70" w:unhideWhenUsed="0"/>
+    <w:lsdException w:name="Colorful Shading Accent 4" w:semiHidden="0" w:uiPriority="71" w:unhideWhenUsed="0"/>
+    <w:lsdException w:name="Colorful List Accent 4" w:semiHidden="0" w:uiPriority="72" w:unhideWhenUsed="0"/>
+    <w:lsdException w:name="Colorful Grid Accent 4" w:semiHidden="0" w:uiPriority="73" w:unhideWhenUsed="0"/>
+    <w:lsdException w:name="Light Shading Accent 5" w:semiHidden="0" w:uiPriority="60" w:unhideWhenUsed="0"/>
+    <w:lsdException w:name="Light List Accent 5" w:semiHidden="0" w:uiPriority="61" w:unhideWhenUsed="0"/>
+    <w:lsdException w:name="Light Grid Accent 5" w:semiHidden="0" w:uiPriority="62" w:unhideWhenUsed="0"/>
+    <w:lsdException w:name="Medium Shading 1 Accent 5" w:semiHidden="0" w:uiPriority="63" w:unhideWhenUsed="0"/>
+    <w:lsdException w:name="Medium Shading 2 Accent 5" w:semiHidden="0" w:uiPriority="64" w:unhideWhenUsed="0"/>
+    <w:lsdException w:name="Medium List 1 Accent 5" w:semiHidden="0" w:uiPriority="65" w:unhideWhenUsed="0"/>
+    <w:lsdException w:name="Medium List 2 Accent 5" w:semiHidden="0" w:uiPriority="66" w:unhideWhenUsed="0"/>
+    <w:lsdException w:name="Medium Grid 1 Accent 5" w:semiHidden="0" w:uiPriority="67" w:unhideWhenUsed="0"/>
+    <w:lsdException w:name="Medium Grid 2 Accent 5" w:semiHidden="0" w:uiPriority="68" w:unhideWhenUsed="0"/>
+    <w:lsdException w:name="Medium Grid 3 Accent 5" w:semiHidden="0" w:uiPriority="69" w:unhideWhenUsed="0"/>
+    <w:lsdException w:name="Dark List Accent 5" w:semiHidden="0" w:uiPriority="70" w:unhideWhenUsed="0"/>
+    <w:lsdException w:name="Colorful Shading Accent 5" w:semiHidden="0" w:uiPriority="71" w:unhideWhenUsed="0"/>
+    <w:lsdException w:name="Colorful List Accent 5" w:semiHidden="0" w:uiPriority="72" w:unhideWhenUsed="0"/>
+    <w:lsdException w:name="Colorful Grid Accent 5" w:semiHidden="0" w:uiPriority="73" w:unhideWhenUsed="0"/>
+    <w:lsdException w:name="Light Shading Accent 6" w:semiHidden="0" w:uiPriority="60" w:unhideWhenUsed="0"/>
+    <w:lsdException w:name="Light List Accent 6" w:semiHidden="0" w:uiPriority="61" w:unhideWhenUsed="0"/>
+    <w:lsdException w:name="Light Grid Accent 6" w:semiHidden="0" w:uiPriority="62" w:unhideWhenUsed="0"/>
+    <w:lsdException w:name="Medium Shading 1 Accent 6" w:semiHidden="0" w:uiPriority="63" w:unhideWhenUsed="0"/>
+    <w:lsdException w:name="Medium Shading 2 Accent 6" w:semiHidden="0" w:uiPriority="64" w:unhideWhenUsed="0"/>
+    <w:lsdException w:name="Medium List 1 Accent 6" w:semiHidden="0" w:uiPriority="65" w:unhideWhenUsed="0"/>
+    <w:lsdException w:name="Medium List 2 Accent 6" w:semiHidden="0" w:uiPriority="66" w:unhideWhenUsed="0"/>
+    <w:lsdException w:name="Medium Grid 1 Accent 6" w:semiHidden="0" w:uiPriority="67" w:unhideWhenUsed="0"/>
+    <w:lsdException w:name="Medium Grid 2 Accent 6" w:semiHidden="0" w:uiPriority="68" w:unhideWhenUsed="0"/>
+    <w:lsdException w:name="Medium Grid 3 Accent 6" w:semiHidden="0" w:uiPriority="69" w:unhideWhenUsed="0"/>
+    <w:lsdException w:name="Dark List Accent 6" w:semiHidden="0" w:uiPriority="70" w:unhideWhenUsed="0"/>
+    <w:lsdException w:name="Colorful Shading Accent 6" w:semiHidden="0" w:uiPriority="71" w:unhideWhenUsed="0"/>
+    <w:lsdException w:name="Colorful List Accent 6" w:semiHidden="0" w:uiPriority="72" w:unhideWhenUsed="0"/>
+    <w:lsdException w:name="Colorful Grid Accent 6" w:semiHidden="0" w:uiPriority="73" w:unhideWhenUsed="0"/>
+    <w:lsdException w:name="Subtle Emphasis" w:semiHidden="0" w:uiPriority="19" w:unhideWhenUsed="0" w:qFormat="1"/>
+    <w:lsdException w:name="Intense Emphasis" w:semiHidden="0" w:uiPriority="21" w:unhideWhenUsed="0" w:qFormat="1"/>
+    <w:lsdException w:name="Subtle Reference" w:semiHidden="0" w:uiPriority="31" w:unhideWhenUsed="0" w:qFormat="1"/>
+    <w:lsdException w:name="Intense Reference" w:semiHidden="0" w:uiPriority="32" w:unhideWhenUsed="0" w:qFormat="1"/>
+    <w:lsdException w:name="Book Title" w:semiHidden="0" w:uiPriority="33" w:unhideWhenUsed="0" w:qFormat="1"/>
+    <w:lsdException w:name="Bibliography" w:uiPriority="37"/>
+    <w:lsdException w:name="TOC Heading" w:uiPriority="39" w:qFormat="1"/>
+  </w:latentStyles>
+  <w:style w:type="paragraph" w:default="1" w:styleId="Normal">
+    <w:name w:val="Normal"/>
+    <w:qFormat/>
+  </w:style>
+  <w:style w:type="character" w:default="1" w:styleId="DefaultParagraphFont">
+    <w:name w:val="Default Paragraph Font"/>
+    <w:uiPriority w:val="1"/>
+    <w:semiHidden/>
+    <w:unhideWhenUsed/>
+  </w:style>
+  <w:style w:type="table" w:default="1" w:styleId="TableNormal">
+    <w:name w:val="Normal Table"/>
+    <w:uiPriority w:val="99"/>
+    <w:semiHidden/>
+    <w:unhideWhenUsed/>
+    <w:tblPr>
+      <w:tblInd w:w="0" w:type="dxa"/>
+      <w:tblCellMar>
+        <w:top w:w="0" w:type="dxa"/>
+        <w:left w:w="108" w:type="dxa"/>
+        <w:bottom w:w="0" w:type="dxa"/>
+        <w:right w:w="108" w:type="dxa"/>
+      </w:tblCellMar>
+    </w:tblPr>
+  </w:style>
+  <w:style w:type="numbering" w:default="1" w:styleId="NoList">
+    <w:name w:val="No List"/>
+    <w:uiPriority w:val="99"/>
+    <w:semiHidden/>
+    <w:unhideWhenUsed/>
+  </w:style>
+</w:styles>
 </file>
</xml_diff>